<commit_message>
update labjournal and manuscript
</commit_message>
<xml_diff>
--- a/papers/_output/paper1.docx
+++ b/papers/_output/paper1.docx
@@ -7,7 +7,7 @@
         <w:pStyle w:val="Title"/>
       </w:pPr>
       <w:r>
-        <w:t xml:space="preserve">Scientific Co-Publishing Networks</w:t>
+        <w:t xml:space="preserve">Popularity Pays—For Whom? Intersectional Inequalities in the Growth of Co-Authorship Networks</w:t>
       </w:r>
     </w:p>
     <w:p>
@@ -49,6 +49,93 @@
       </w:pPr>
       <w:r>
         <w:t xml:space="preserve">Introduction</w:t>
+      </w:r>
+    </w:p>
+    <w:p>
+      <w:pPr>
+        <w:pStyle w:val="FirstParagraph"/>
+      </w:pPr>
+      <w:r>
+        <w:rPr>
+          <w:b/>
+          <w:bCs/>
+        </w:rPr>
+        <w:t xml:space="preserve">RQ1:</w:t>
+      </w:r>
+      <w:r>
+        <w:t xml:space="preserve"> </w:t>
+      </w:r>
+      <w:r>
+        <w:rPr>
+          <w:i/>
+          <w:iCs/>
+        </w:rPr>
+        <w:t xml:space="preserve">Do scholars preferentially form new co-publishing ties within their intersectional stratum (gender × nationality × position), and is this within-stratum preference weaker when potential alters are high-status (central and/or senior)?</w:t>
+      </w:r>
+    </w:p>
+    <w:p>
+      <w:pPr>
+        <w:pStyle w:val="BodyText"/>
+      </w:pPr>
+      <w:r>
+        <w:rPr>
+          <w:b/>
+          <w:bCs/>
+        </w:rPr>
+        <w:t xml:space="preserve">RQ2:</w:t>
+      </w:r>
+      <w:r>
+        <w:t xml:space="preserve"> </w:t>
+      </w:r>
+      <w:r>
+        <w:rPr>
+          <w:i/>
+          <w:iCs/>
+        </w:rPr>
+        <w:t xml:space="preserve">Are gender, nationality, and seniority preferences symmetric, or do majority/men show stronger same-group collaboration than minority/women—and how does gender × nationality shape boundary crossing?</w:t>
+      </w:r>
+    </w:p>
+    <w:p>
+      <w:pPr>
+        <w:pStyle w:val="BodyText"/>
+      </w:pPr>
+      <w:r>
+        <w:rPr>
+          <w:b/>
+          <w:bCs/>
+        </w:rPr>
+        <w:t xml:space="preserve">RQ3:</w:t>
+      </w:r>
+      <w:r>
+        <w:t xml:space="preserve"> </w:t>
+      </w:r>
+      <w:r>
+        <w:rPr>
+          <w:i/>
+          <w:iCs/>
+        </w:rPr>
+        <w:t xml:space="preserve">Do intersectional groups convert current popularity (indegree) into future in-ties equally, or do some strata gain more from being</w:t>
+      </w:r>
+      <w:r>
+        <w:rPr>
+          <w:i/>
+          <w:iCs/>
+        </w:rPr>
+        <w:t xml:space="preserve"> </w:t>
+      </w:r>
+      <w:r>
+        <w:rPr>
+          <w:i/>
+          <w:iCs/>
+        </w:rPr>
+        <w:t xml:space="preserve">“popular”</w:t>
+      </w:r>
+      <w:r>
+        <w:rPr>
+          <w:i/>
+          <w:iCs/>
+        </w:rPr>
+        <w:t xml:space="preserve">?</w:t>
       </w:r>
     </w:p>
     <w:bookmarkEnd w:id="20"/>

</xml_diff>

<commit_message>
added title suggestions for paper 1
</commit_message>
<xml_diff>
--- a/papers/_output/paper1.docx
+++ b/papers/_output/paper1.docx
@@ -54,6 +54,32 @@
     <w:p>
       <w:pPr>
         <w:pStyle w:val="FirstParagraph"/>
+      </w:pPr>
+      <w:r>
+        <w:t xml:space="preserve">Other suggestions for titles:</w:t>
+      </w:r>
+      <w:r>
+        <w:t xml:space="preserve"> </w:t>
+      </w:r>
+      <w:r>
+        <w:t xml:space="preserve">- The Collaboration Gradient: Seniority, Centrality, and Intersectional Sorting</w:t>
+      </w:r>
+      <w:r>
+        <w:t xml:space="preserve"> </w:t>
+      </w:r>
+      <w:r>
+        <w:t xml:space="preserve">- Crossing Lines, Climbing Ladders: Intersectional Inequality in Co-Publishing Networks</w:t>
+      </w:r>
+      <w:r>
+        <w:t xml:space="preserve"> </w:t>
+      </w:r>
+      <w:r>
+        <w:t xml:space="preserve">- Privileges in Print: Unequal Returns to Popularity Across Intersectional Strata</w:t>
+      </w:r>
+    </w:p>
+    <w:p>
+      <w:pPr>
+        <w:pStyle w:val="BodyText"/>
       </w:pPr>
       <w:r>
         <w:rPr>

</xml_diff>

<commit_message>
edits draft introduction + delete old_ data files
</commit_message>
<xml_diff>
--- a/papers/_output/paper1.docx
+++ b/papers/_output/paper1.docx
@@ -62,10 +62,10 @@
         <w:t xml:space="preserve"> </w:t>
       </w:r>
       <w:r>
-        <w:t xml:space="preserve">(Barrios et al., 2013; e.g., Bol, 2023; Greska, 2023; L. Kim et al., 2022; Lutter &amp; Schröder, 2016)</w:t>
-      </w:r>
-      <w:r>
-        <w:t xml:space="preserve">. Prior work shows that women have lower salaries</w:t>
+        <w:t xml:space="preserve">(e.g., Barrios et al., 2013; Bol, 2023; Greska, 2023; L. Kim et al., 2022; Lutter &amp; Schröder, 2016)</w:t>
+      </w:r>
+      <w:r>
+        <w:t xml:space="preserve">, which has shown that women have lower salaries</w:t>
       </w:r>
       <w:r>
         <w:t xml:space="preserve"> </w:t>
@@ -181,7 +181,7 @@
         <w:t xml:space="preserve">(Barrios et al., 2013; Kwiek &amp; Roszka, 2021; Whittington et al., 2024)</w:t>
       </w:r>
       <w:r>
-        <w:t xml:space="preserve">. Scholars from less prestigious institutions or from countries outside the traditional scientific core similarly face barriers to entering central collaboration circuits and forming ties with highly visible partners</w:t>
+        <w:t xml:space="preserve">. Scholars from countries outside the traditional scientific core similarly face barriers to entering central collaboration circuits and forming ties with highly visible partners</w:t>
       </w:r>
       <w:r>
         <w:t xml:space="preserve"> </w:t>
@@ -234,7 +234,7 @@
         <w:t xml:space="preserve"> </w:t>
       </w:r>
       <w:r>
-        <w:t xml:space="preserve">for women. These metaphors highlight that socialisation into science, and the path dependencies it creates later in careers, can be fragile for women scientists. However, they are less specific about the concrete relational mechanisms through which exclusion occurs. From a social network perspective, the question becomes which network processes and structural positions restrict women’s access to promising career trajectories and supportive professional contexts. Given the centrality of social relationships to academic success, collaboration networks provide a natural empirical setting in which to investigate these mechanisms.</w:t>
+        <w:t xml:space="preserve">for women. These metaphors highlight that socialisation into science, and the path dependencies it creates in careers, can be fragile for women scientists. However, they are less specific about the concrete relational mechanisms through which exclusion occurs. From a social network perspective, the question becomes which network processes and structural positions restrict women’s access to promising career trajectories and supportive professional environments. Given the centrality of social relationships to academic success, collaboration networks provide a natural empirical setting in which to investigate these mechanisms.</w:t>
       </w:r>
     </w:p>
     <w:p>
@@ -242,7 +242,7 @@
         <w:pStyle w:val="BodyText"/>
       </w:pPr>
       <w:r>
-        <w:t xml:space="preserve">Co-authorship is particularly important in this respect. Co-authorship structures shape productivity, visibility, and citation impact, and they evolve systematically over time</w:t>
+        <w:t xml:space="preserve">Co-authorship is particularly important in this respect, as these shape productivity, visibility, and citation impact, and they evolve systematically over time</w:t>
       </w:r>
       <w:r>
         <w:t xml:space="preserve"> </w:t>
@@ -348,7 +348,7 @@
         <w:pStyle w:val="BodyText"/>
       </w:pPr>
       <w:r>
-        <w:t xml:space="preserve">Second, there are origin-based differences in collaboration networks. Origin- and nationality-based inequalities arise in who participates in international collaboration and who occupies central positions in global networks. Scholars in peripheral or resource-poor systems, and those from underrepresented nationality groups within core countries, are less likely to collaborate internationally and more likely to occupy peripheral positions</w:t>
+        <w:t xml:space="preserve">Second, there are origin-based differences in collaboration networks. Origin- and nationality-based inequalities arise in who participates in international collaboration and who occupies central positions in global networks. Scholars from underrepresented nationality groups within core countries, are more likely to occupy peripheral positions</w:t>
       </w:r>
       <w:r>
         <w:t xml:space="preserve"> </w:t>
@@ -357,7 +357,7 @@
         <w:t xml:space="preserve">(Hâncean et al., 2014; Khor &amp; Yu, 2016; J. Kim et al., 2016; Kwiek &amp; Roszka, 2021)</w:t>
       </w:r>
       <w:r>
-        <w:t xml:space="preserve">. These positional disadvantages reduce exposure to high-impact venues and influential collaborators, contributing to lower citation impact and slower career progression. Origin-based gaps are further reinforced by institutional prestige hierarchies</w:t>
+        <w:t xml:space="preserve">. These positional disadvantages reduce exposure to high-impact journals and influential collaborators, contributing to lower citation impact and slower career progression. Origin-based gaps are further reinforced by institutional prestige hierarchies</w:t>
       </w:r>
       <w:r>
         <w:t xml:space="preserve"> </w:t>
@@ -513,7 +513,7 @@
         <w:t xml:space="preserve">(Gao et al., 2022; e.g., Kwiek &amp; Roszka, 2021)</w:t>
       </w:r>
       <w:r>
-        <w:t xml:space="preserve">, we examine how much of the observed inequality remains once structural mechanisms are taken into account. This shifts the focus from descriptive differences to the network processes through which inequalities are generated and maintained. Because our data provide rich information on all actors in the network and approximate a full-population sample, we can also address survivor bias and sample selection problems that arise in bibliometric studies focused only on highly productive scholars or selected journals</w:t>
+        <w:t xml:space="preserve">, we examine how much of the observed inequality remains once structural mechanisms are taken into account. This shifts the focus from descriptive differences to the network processes through which inequalities are reproduced. Because our data provide rich information on all actors in the network and approximate a full-population sample, we can also address survivor bias and sample selection problems that arise in bibliometric studies focused only on highly productive scholars or selected journals</w:t>
       </w:r>
       <w:r>
         <w:t xml:space="preserve"> </w:t>

</xml_diff>

<commit_message>
update website and draft introduction
</commit_message>
<xml_diff>
--- a/papers/_output/paper1.docx
+++ b/papers/_output/paper1.docx
@@ -42,7 +42,15 @@
         <w:t xml:space="preserve">Roza Meuleman</w:t>
       </w:r>
     </w:p>
-    <w:bookmarkStart w:id="20" w:name="introduction"/>
+    <w:p>
+      <w:pPr>
+        <w:pStyle w:val="Date"/>
+      </w:pPr>
+      <w:r>
+        <w:t xml:space="preserve">Saturday, November 15, 2025</w:t>
+      </w:r>
+    </w:p>
+    <w:bookmarkStart w:id="26" w:name="introduction"/>
     <w:p>
       <w:pPr>
         <w:pStyle w:val="Heading2"/>
@@ -51,6 +59,215 @@
         <w:t xml:space="preserve">Introduction</w:t>
       </w:r>
     </w:p>
+    <w:tbl>
+      <w:tblPr>
+        <w:tblStyle w:val="Table"/>
+        <w:tblLook w:firstRow="0" w:lastRow="0" w:firstColumn="0" w:lastColumn="0" w:noHBand="0" w:noVBand="0" w:val="0000"/>
+        <w:tblBorders>
+          <w:top w:val="single" w:sz="4" w:space="0" w:color="0758E5"/>
+          <w:left w:val="single" w:sz="24" w:space="0" w:color="0758E5"/>
+          <w:bottom w:val="single" w:sz="4" w:space="0" w:color="0758E5"/>
+          <w:right w:val="single" w:sz="4" w:space="0" w:color="0758E5"/>
+        </w:tblBorders>
+        <w:tblCellMar>
+          <w:left w:w="144" w:type="dxa"/>
+          <w:right w:w="144" w:type="dxa"/>
+        </w:tblCellMar>
+        <w:tblLook w:firstRow="0" w:lastRow="0" w:firstColumn="0" w:lastColumn="0" w:noHBand="0" w:noVBand="0" w:val="0000"/>
+      </w:tblPr>
+      <w:tr>
+        <w:trPr>
+          <w:cantSplit/>
+        </w:trPr>
+        <w:tc>
+          <w:tcPr>
+            <w:shd w:color="auto" w:fill="dae6fb" w:val="clear"/>
+            <w:tcMar>
+              <w:top w:w="92" w:type="dxa"/>
+              <w:bottom w:w="92" w:type="dxa"/>
+            </w:tcMar>
+          </w:tcPr>
+          <w:p>
+            <w:pPr>
+              <w:pStyle w:val="FirstParagraph"/>
+            </w:pPr>
+            <w:pPr>
+              <w:spacing w:before="0" w:after="0"/>
+              <w:textAlignment w:val="center"/>
+            </w:pPr>
+            <w:r>
+              <w:drawing>
+                <wp:inline>
+                  <wp:extent cx="152400" cy="152400"/>
+                  <wp:effectExtent b="0" l="0" r="0" t="0"/>
+                  <wp:docPr descr="" title="" id="21" name="Picture"/>
+                  <a:graphic>
+                    <a:graphicData uri="http://schemas.openxmlformats.org/drawingml/2006/picture">
+                      <pic:pic>
+                        <pic:nvPicPr>
+                          <pic:cNvPr descr="/Applications/quarto/share/formats/docx/note.png" id="22" name="Picture"/>
+                          <pic:cNvPicPr>
+                            <a:picLocks noChangeArrowheads="1" noChangeAspect="1"/>
+                          </pic:cNvPicPr>
+                        </pic:nvPicPr>
+                        <pic:blipFill>
+                          <a:blip r:embed="rId20"/>
+                          <a:stretch>
+                            <a:fillRect/>
+                          </a:stretch>
+                        </pic:blipFill>
+                        <pic:spPr bwMode="auto">
+                          <a:xfrm>
+                            <a:off x="0" y="0"/>
+                            <a:ext cx="152400" cy="152400"/>
+                          </a:xfrm>
+                          <a:prstGeom prst="rect">
+                            <a:avLst/>
+                          </a:prstGeom>
+                          <a:noFill/>
+                          <a:ln w="9525">
+                            <a:noFill/>
+                            <a:headEnd/>
+                            <a:tailEnd/>
+                          </a:ln>
+                        </pic:spPr>
+                      </pic:pic>
+                    </a:graphicData>
+                  </a:graphic>
+                </wp:inline>
+              </w:drawing>
+            </w:r>
+            <w:r>
+              <w:t xml:space="preserve"> </w:t>
+            </w:r>
+            <w:r>
+              <w:t xml:space="preserve"> </w:t>
+            </w:r>
+            <w:r>
+              <w:t xml:space="preserve">Note</w:t>
+            </w:r>
+          </w:p>
+        </w:tc>
+      </w:tr>
+      <w:tr>
+        <w:trPr>
+          <w:cantSplit/>
+        </w:trPr>
+        <w:tc>
+          <w:tcPr>
+            <w:tcMar>
+              <w:top w:w="108" w:type="dxa"/>
+              <w:bottom w:w="108" w:type="dxa"/>
+            </w:tcMar>
+          </w:tcPr>
+          <w:p>
+            <w:pPr>
+              <w:pStyle w:val="BodyText"/>
+            </w:pPr>
+            <w:pPr>
+              <w:spacing w:before="16"/>
+            </w:pPr>
+            <w:r>
+              <w:t xml:space="preserve">Some points for consideration while reading:</w:t>
+            </w:r>
+          </w:p>
+          <w:p>
+            <w:pPr>
+              <w:pStyle w:val="Compact"/>
+              <w:numPr>
+                <w:ilvl w:val="0"/>
+                <w:numId w:val="1001"/>
+              </w:numPr>
+            </w:pPr>
+            <w:r>
+              <w:t xml:space="preserve">When writing the current draft I have not considered the length of the text. Admittingly, the text in it’s current from is on the longer side. Directions on shorting the introduction is welcomed.</w:t>
+            </w:r>
+          </w:p>
+          <w:p>
+            <w:pPr>
+              <w:pStyle w:val="Compact"/>
+              <w:numPr>
+                <w:ilvl w:val="0"/>
+                <w:numId w:val="1001"/>
+              </w:numPr>
+            </w:pPr>
+            <w:r>
+              <w:t xml:space="preserve">I’m currently not happy with the term</w:t>
+            </w:r>
+            <w:r>
+              <w:t xml:space="preserve"> </w:t>
+            </w:r>
+            <w:r>
+              <w:t xml:space="preserve">“origin”</w:t>
+            </w:r>
+            <w:r>
+              <w:t xml:space="preserve">, alternatives like ethnicity or nationality have been considered but do also not completely do justice to the operationalization</w:t>
+            </w:r>
+          </w:p>
+          <w:p>
+            <w:pPr>
+              <w:pStyle w:val="Compact"/>
+              <w:numPr>
+                <w:ilvl w:val="0"/>
+                <w:numId w:val="1001"/>
+              </w:numPr>
+            </w:pPr>
+            <w:r>
+              <w:t xml:space="preserve">For the arguments for origin-based differences in outcomes and (network) opportunities have been predominantly sourced from the status quo in the science of science literature. One argument that is currently lacking is the potential for</w:t>
+            </w:r>
+            <w:r>
+              <w:t xml:space="preserve"> </w:t>
+            </w:r>
+            <w:r>
+              <w:t xml:space="preserve">“bias/discrimination”</w:t>
+            </w:r>
+            <w:r>
+              <w:t xml:space="preserve">, which has currently not been convincingly made in this literature. Do we want to explicitly state the potential for (implicit) discrimination or do wo want to adhere to the traditions in this literature.</w:t>
+            </w:r>
+          </w:p>
+          <w:p>
+            <w:pPr>
+              <w:pStyle w:val="Compact"/>
+              <w:numPr>
+                <w:ilvl w:val="0"/>
+                <w:numId w:val="1001"/>
+              </w:numPr>
+            </w:pPr>
+            <w:r>
+              <w:t xml:space="preserve">I have intentionally made the intersectional argument as concise as possible, do you feel that the argument as such is sufficient?</w:t>
+            </w:r>
+          </w:p>
+          <w:p>
+            <w:pPr>
+              <w:pStyle w:val="Compact"/>
+              <w:numPr>
+                <w:ilvl w:val="0"/>
+                <w:numId w:val="1001"/>
+              </w:numPr>
+            </w:pPr>
+            <w:r>
+              <w:t xml:space="preserve">I have reformulated the research questions to be even more substantive. Admittingly, the explanatory research questions remain on the dyadic level. Do you have suggestions to also include a ego, network level in here?</w:t>
+            </w:r>
+          </w:p>
+          <w:p>
+            <w:pPr>
+              <w:pStyle w:val="Compact"/>
+              <w:numPr>
+                <w:ilvl w:val="0"/>
+                <w:numId w:val="1001"/>
+              </w:numPr>
+            </w:pPr>
+            <w:r>
+              <w:t xml:space="preserve">I have made the levels (ego, dyad, network) implicit in the argument thus far out of concern for the argument getting too extensive when incorporating these levels explicitly, do you feel that the current argument requires such explication?</w:t>
+            </w:r>
+            <w:r>
+              <w:br/>
+            </w:r>
+          </w:p>
+          <w:p/>
+        </w:tc>
+      </w:tr>
+    </w:tbl>
     <w:p>
       <w:pPr>
         <w:pStyle w:val="FirstParagraph"/>
@@ -574,7 +791,7 @@
       <w:pPr>
         <w:numPr>
           <w:ilvl w:val="0"/>
-          <w:numId w:val="1001"/>
+          <w:numId w:val="1002"/>
         </w:numPr>
       </w:pPr>
       <w:r>
@@ -586,7 +803,7 @@
         <w:pStyle w:val="Compact"/>
         <w:numPr>
           <w:ilvl w:val="1"/>
-          <w:numId w:val="1002"/>
+          <w:numId w:val="1003"/>
         </w:numPr>
       </w:pPr>
       <w:r>
@@ -601,70 +818,6 @@
       </w:r>
       <w:r>
         <w:t xml:space="preserve">To what extent are there gender- and origin-based differences in collaboration (networks)?</w:t>
-      </w:r>
-    </w:p>
-    <w:p>
-      <w:pPr>
-        <w:pStyle w:val="Compact"/>
-        <w:numPr>
-          <w:ilvl w:val="2"/>
-          <w:numId w:val="1003"/>
-        </w:numPr>
-      </w:pPr>
-      <w:r>
-        <w:t xml:space="preserve">At the ego level, we compare differences in the number of collaborations (degree), brokerage and bridging (betweenness, structural holes/constraint), and local clustering across gender and origin groups. This follows prior work that links network position to productivity and impact</w:t>
-      </w:r>
-      <w:r>
-        <w:t xml:space="preserve"> </w:t>
-      </w:r>
-      <w:r>
-        <w:t xml:space="preserve">(Collischon &amp; Eberl, 2021; Ductor, 2015; Li et al., 2022)</w:t>
-      </w:r>
-      <w:r>
-        <w:t xml:space="preserve">.</w:t>
-      </w:r>
-    </w:p>
-    <w:p>
-      <w:pPr>
-        <w:pStyle w:val="Compact"/>
-        <w:numPr>
-          <w:ilvl w:val="2"/>
-          <w:numId w:val="1003"/>
-        </w:numPr>
-      </w:pPr>
-      <w:r>
-        <w:t xml:space="preserve">At the network level, we examine global clustering, transitivity, assortativity by gender and origin, and the overall core–periphery structure of the co-authorship network, building on studies of national and disciplinary collaboration structures</w:t>
-      </w:r>
-      <w:r>
-        <w:t xml:space="preserve"> </w:t>
-      </w:r>
-      <w:r>
-        <w:t xml:space="preserve">(Abbasi et al., 2011; Ferligoj et al., 2015; Hâncean et al., 2014; Hou et al., 2007)</w:t>
-      </w:r>
-      <w:r>
-        <w:t xml:space="preserve">.</w:t>
-      </w:r>
-    </w:p>
-    <w:p>
-      <w:pPr>
-        <w:pStyle w:val="Compact"/>
-        <w:numPr>
-          <w:ilvl w:val="1"/>
-          <w:numId w:val="1002"/>
-        </w:numPr>
-      </w:pPr>
-      <w:r>
-        <w:rPr>
-          <w:b/>
-          <w:bCs/>
-        </w:rPr>
-        <w:t xml:space="preserve">RQ2:</w:t>
-      </w:r>
-      <w:r>
-        <w:t xml:space="preserve"> </w:t>
-      </w:r>
-      <w:r>
-        <w:t xml:space="preserve">To what extent are there gender- and origin-based differences in homophily? Do actors tend to choose collaborators who share their gender or origin?</w:t>
       </w:r>
     </w:p>
     <w:p>
@@ -676,13 +829,34 @@
         </w:numPr>
       </w:pPr>
       <w:r>
-        <w:t xml:space="preserve">At the dyadic level, we estimate homophily and status asymmetries using longitudinal tie-formation models (e.g. SAOMs or related dynamic network models) that include endogenous structural effects (closure, activity, popularity) and covariate effects for gender and nationality using ego, alter, and similarity terms (egoX, altX, sameX). This allows us to quantify whether, net of structural tendencies and productivity, scholars systematically prefer same-gender or same-origin collaborators and whether majority scholars are more likely to be selected as alters than minority scholars</w:t>
-      </w:r>
-      <w:r>
-        <w:t xml:space="preserve"> </w:t>
-      </w:r>
-      <w:r>
-        <w:t xml:space="preserve">(Block et al., 2019; Kwiek &amp; Roszka, 2021)</w:t>
+        <w:t xml:space="preserve">At the ego level, we compare differences in the number of collaborations (degree), brokerage and bridging (betweenness, structural holes/constraint), and local clustering across gender and origin groups. This follows prior work that links network position to productivity and impact</w:t>
+      </w:r>
+      <w:r>
+        <w:t xml:space="preserve"> </w:t>
+      </w:r>
+      <w:r>
+        <w:t xml:space="preserve">(Collischon &amp; Eberl, 2021; Ductor, 2015; Li et al., 2022)</w:t>
+      </w:r>
+      <w:r>
+        <w:t xml:space="preserve">.</w:t>
+      </w:r>
+    </w:p>
+    <w:p>
+      <w:pPr>
+        <w:pStyle w:val="Compact"/>
+        <w:numPr>
+          <w:ilvl w:val="2"/>
+          <w:numId w:val="1004"/>
+        </w:numPr>
+      </w:pPr>
+      <w:r>
+        <w:t xml:space="preserve">At the network level, we examine global clustering, transitivity, assortativity by gender and origin, and the overall core–periphery structure of the co-authorship network, building on studies of national and disciplinary collaboration structures</w:t>
+      </w:r>
+      <w:r>
+        <w:t xml:space="preserve"> </w:t>
+      </w:r>
+      <w:r>
+        <w:t xml:space="preserve">(Abbasi et al., 2011; Ferligoj et al., 2015; Hâncean et al., 2014; Hou et al., 2007)</w:t>
       </w:r>
       <w:r>
         <w:t xml:space="preserve">.</w:t>
@@ -693,7 +867,7 @@
         <w:pStyle w:val="Compact"/>
         <w:numPr>
           <w:ilvl w:val="1"/>
-          <w:numId w:val="1002"/>
+          <w:numId w:val="1003"/>
         </w:numPr>
       </w:pPr>
       <w:r>
@@ -701,13 +875,13 @@
           <w:b/>
           <w:bCs/>
         </w:rPr>
-        <w:t xml:space="preserve">RQ3:</w:t>
-      </w:r>
-      <w:r>
-        <w:t xml:space="preserve"> </w:t>
-      </w:r>
-      <w:r>
-        <w:t xml:space="preserve">To what extent does gender- and origin-based homophily intersect? Do actors tend to choose collaborators who share both their gender and their origin?</w:t>
+        <w:t xml:space="preserve">RQ2:</w:t>
+      </w:r>
+      <w:r>
+        <w:t xml:space="preserve"> </w:t>
+      </w:r>
+      <w:r>
+        <w:t xml:space="preserve">To what extent are there gender- and origin-based differences in homophily? Do actors tend to choose collaborators who share their gender or origin?</w:t>
       </w:r>
     </w:p>
     <w:p>
@@ -719,13 +893,13 @@
         </w:numPr>
       </w:pPr>
       <w:r>
-        <w:t xml:space="preserve">We extend the dyadic models to include interaction terms for gender × origin similarity, and to differentiate homophily for intersectional groups. This enables us to test whether, for example, international women exhibit particularly strong same-origin homophily (perhaps as a strategy of protection), or whether majority-group men exhibit strong same-gender, same-origin closure that excludes others. By comparing these patterns across groups, we can assess whether intersectional homophily contributes to the reproduction of intersectional inequalities observed in network positions and outcomes</w:t>
-      </w:r>
-      <w:r>
-        <w:t xml:space="preserve"> </w:t>
-      </w:r>
-      <w:r>
-        <w:t xml:space="preserve">(Hofstra et al., 2020; Kozlowski et al., 2022; Whittington et al., 2024)</w:t>
+        <w:t xml:space="preserve">At the dyadic level, we estimate homophily and status asymmetries using longitudinal tie-formation models (e.g. SAOMs or related dynamic network models) that include endogenous structural effects (closure, activity, popularity) and covariate effects for gender and nationality using ego, alter, and similarity terms (egoX, altX, sameX). This allows us to quantify whether, net of structural tendencies and productivity, scholars systematically prefer same-gender or same-origin collaborators and whether majority scholars are more likely to be selected as alters than minority scholars</w:t>
+      </w:r>
+      <w:r>
+        <w:t xml:space="preserve"> </w:t>
+      </w:r>
+      <w:r>
+        <w:t xml:space="preserve">(Block et al., 2019; Kwiek &amp; Roszka, 2021)</w:t>
       </w:r>
       <w:r>
         <w:t xml:space="preserve">.</w:t>
@@ -736,7 +910,7 @@
         <w:pStyle w:val="Compact"/>
         <w:numPr>
           <w:ilvl w:val="1"/>
-          <w:numId w:val="1002"/>
+          <w:numId w:val="1003"/>
         </w:numPr>
       </w:pPr>
       <w:r>
@@ -744,13 +918,13 @@
           <w:b/>
           <w:bCs/>
         </w:rPr>
-        <w:t xml:space="preserve">RQ4:</w:t>
-      </w:r>
-      <w:r>
-        <w:t xml:space="preserve"> </w:t>
-      </w:r>
-      <w:r>
-        <w:t xml:space="preserve">Do key network processes - such as triadic closure and status-bridging - operate differently across gender, origin, and their intersection?</w:t>
+        <w:t xml:space="preserve">RQ3:</w:t>
+      </w:r>
+      <w:r>
+        <w:t xml:space="preserve"> </w:t>
+      </w:r>
+      <w:r>
+        <w:t xml:space="preserve">To what extent does gender- and origin-based homophily intersect? Do actors tend to choose collaborators who share both their gender and their origin?</w:t>
       </w:r>
     </w:p>
     <w:p>
@@ -762,6 +936,49 @@
         </w:numPr>
       </w:pPr>
       <w:r>
+        <w:t xml:space="preserve">We extend the dyadic models to include interaction terms for gender × origin similarity, and to differentiate homophily for intersectional groups. This enables us to test whether, for example, international women exhibit particularly strong same-origin homophily (perhaps as a strategy of protection), or whether majority-group men exhibit strong same-gender, same-origin closure that excludes others. By comparing these patterns across groups, we can assess whether intersectional homophily contributes to the reproduction of intersectional inequalities observed in network positions and outcomes</w:t>
+      </w:r>
+      <w:r>
+        <w:t xml:space="preserve"> </w:t>
+      </w:r>
+      <w:r>
+        <w:t xml:space="preserve">(Hofstra et al., 2020; Kozlowski et al., 2022; Whittington et al., 2024)</w:t>
+      </w:r>
+      <w:r>
+        <w:t xml:space="preserve">.</w:t>
+      </w:r>
+    </w:p>
+    <w:p>
+      <w:pPr>
+        <w:pStyle w:val="Compact"/>
+        <w:numPr>
+          <w:ilvl w:val="1"/>
+          <w:numId w:val="1003"/>
+        </w:numPr>
+      </w:pPr>
+      <w:r>
+        <w:rPr>
+          <w:b/>
+          <w:bCs/>
+        </w:rPr>
+        <w:t xml:space="preserve">RQ4:</w:t>
+      </w:r>
+      <w:r>
+        <w:t xml:space="preserve"> </w:t>
+      </w:r>
+      <w:r>
+        <w:t xml:space="preserve">Do key network processes - such as triadic closure and status-bridging - operate differently across gender, origin, and their intersection?</w:t>
+      </w:r>
+    </w:p>
+    <w:p>
+      <w:pPr>
+        <w:pStyle w:val="Compact"/>
+        <w:numPr>
+          <w:ilvl w:val="2"/>
+          <w:numId w:val="1007"/>
+        </w:numPr>
+      </w:pPr>
+      <w:r>
         <w:t xml:space="preserve">Using longitudinal tie-formation models, we examine whether structural effects that capture triadic closure and status-bridging (i.e., forming ties to alters with high status, centrality, or h-index) vary by gender, origin, and gender × origin. Concretely, we allow the strength of closure and status-related popularity effects to differ between intersectional groups, in order to assess whether majority-group men are more likely to benefit from closure and high-status collaborations than women and minoritized scholars, and whether international women are systematically excluded from such status-bridging processes.</w:t>
       </w:r>
     </w:p>
@@ -783,8 +1000,164 @@
         <w:t xml:space="preserve">&lt;description of emperical case goes here&gt;</w:t>
       </w:r>
     </w:p>
-    <w:bookmarkEnd w:id="20"/>
-    <w:bookmarkStart w:id="120" w:name="references"/>
+    <w:tbl>
+      <w:tblPr>
+        <w:tblStyle w:val="Table"/>
+        <w:tblLook w:firstRow="0" w:lastRow="0" w:firstColumn="0" w:lastColumn="0" w:noHBand="0" w:noVBand="0" w:val="0000"/>
+        <w:tblBorders>
+          <w:top w:val="single" w:sz="4" w:space="0" w:color="00A047"/>
+          <w:left w:val="single" w:sz="24" w:space="0" w:color="00A047"/>
+          <w:bottom w:val="single" w:sz="4" w:space="0" w:color="00A047"/>
+          <w:right w:val="single" w:sz="4" w:space="0" w:color="00A047"/>
+        </w:tblBorders>
+        <w:tblCellMar>
+          <w:left w:w="144" w:type="dxa"/>
+          <w:right w:w="144" w:type="dxa"/>
+        </w:tblCellMar>
+        <w:tblLook w:firstRow="0" w:lastRow="0" w:firstColumn="0" w:lastColumn="0" w:noHBand="0" w:noVBand="0" w:val="0000"/>
+      </w:tblPr>
+      <w:tr>
+        <w:trPr>
+          <w:cantSplit/>
+        </w:trPr>
+        <w:tc>
+          <w:tcPr>
+            <w:shd w:color="auto" w:fill="ccf1e3" w:val="clear"/>
+            <w:tcMar>
+              <w:top w:w="92" w:type="dxa"/>
+              <w:bottom w:w="92" w:type="dxa"/>
+            </w:tcMar>
+          </w:tcPr>
+          <w:p>
+            <w:pPr>
+              <w:pStyle w:val="BodyText"/>
+            </w:pPr>
+            <w:pPr>
+              <w:spacing w:before="0" w:after="0"/>
+              <w:textAlignment w:val="center"/>
+            </w:pPr>
+            <w:r>
+              <w:drawing>
+                <wp:inline>
+                  <wp:extent cx="152400" cy="152400"/>
+                  <wp:effectExtent b="0" l="0" r="0" t="0"/>
+                  <wp:docPr descr="" title="" id="24" name="Picture"/>
+                  <a:graphic>
+                    <a:graphicData uri="http://schemas.openxmlformats.org/drawingml/2006/picture">
+                      <pic:pic>
+                        <pic:nvPicPr>
+                          <pic:cNvPr descr="/Applications/quarto/share/formats/docx/tip.png" id="25" name="Picture"/>
+                          <pic:cNvPicPr>
+                            <a:picLocks noChangeArrowheads="1" noChangeAspect="1"/>
+                          </pic:cNvPicPr>
+                        </pic:nvPicPr>
+                        <pic:blipFill>
+                          <a:blip r:embed="rId23"/>
+                          <a:stretch>
+                            <a:fillRect/>
+                          </a:stretch>
+                        </pic:blipFill>
+                        <pic:spPr bwMode="auto">
+                          <a:xfrm>
+                            <a:off x="0" y="0"/>
+                            <a:ext cx="152400" cy="152400"/>
+                          </a:xfrm>
+                          <a:prstGeom prst="rect">
+                            <a:avLst/>
+                          </a:prstGeom>
+                          <a:noFill/>
+                          <a:ln w="9525">
+                            <a:noFill/>
+                            <a:headEnd/>
+                            <a:tailEnd/>
+                          </a:ln>
+                        </pic:spPr>
+                      </pic:pic>
+                    </a:graphicData>
+                  </a:graphic>
+                </wp:inline>
+              </w:drawing>
+            </w:r>
+            <w:r>
+              <w:t xml:space="preserve"> </w:t>
+            </w:r>
+            <w:r>
+              <w:t xml:space="preserve"> </w:t>
+            </w:r>
+            <w:r>
+              <w:t xml:space="preserve">Tip</w:t>
+            </w:r>
+          </w:p>
+        </w:tc>
+      </w:tr>
+      <w:tr>
+        <w:trPr>
+          <w:cantSplit/>
+        </w:trPr>
+        <w:tc>
+          <w:tcPr>
+            <w:tcMar>
+              <w:top w:w="108" w:type="dxa"/>
+              <w:bottom w:w="108" w:type="dxa"/>
+            </w:tcMar>
+          </w:tcPr>
+          <w:p>
+            <w:pPr>
+              <w:pStyle w:val="BodyText"/>
+            </w:pPr>
+            <w:pPr>
+              <w:spacing w:before="16"/>
+            </w:pPr>
+            <w:r>
+              <w:t xml:space="preserve">I currently have chosen</w:t>
+            </w:r>
+            <w:r>
+              <w:t xml:space="preserve"> </w:t>
+            </w:r>
+            <w:r>
+              <w:rPr>
+                <w:i/>
+                <w:iCs/>
+              </w:rPr>
+              <w:t xml:space="preserve">Social Networks</w:t>
+            </w:r>
+            <w:r>
+              <w:t xml:space="preserve"> </w:t>
+            </w:r>
+            <w:r>
+              <w:t xml:space="preserve">as the target journal. Some points for discussion:</w:t>
+            </w:r>
+          </w:p>
+          <w:p>
+            <w:pPr>
+              <w:pStyle w:val="Compact"/>
+              <w:numPr>
+                <w:ilvl w:val="0"/>
+                <w:numId w:val="1008"/>
+              </w:numPr>
+            </w:pPr>
+            <w:r>
+              <w:t xml:space="preserve">do you feel that the current introduction does adhere to this journal’s standards and conventions?</w:t>
+            </w:r>
+          </w:p>
+          <w:p>
+            <w:pPr>
+              <w:pStyle w:val="Compact"/>
+              <w:numPr>
+                <w:ilvl w:val="0"/>
+                <w:numId w:val="1008"/>
+              </w:numPr>
+            </w:pPr>
+            <w:r>
+              <w:t xml:space="preserve">this journal requires ethical approval for be eligible for publishing. Has this project required ethical approval?</w:t>
+            </w:r>
+          </w:p>
+          <w:p/>
+        </w:tc>
+      </w:tr>
+    </w:tbl>
+    <w:bookmarkEnd w:id="26"/>
+    <w:bookmarkStart w:id="126" w:name="references"/>
     <w:p>
       <w:pPr>
         <w:pStyle w:val="Heading2"/>
@@ -793,8 +1166,8 @@
         <w:t xml:space="preserve">References</w:t>
       </w:r>
     </w:p>
-    <w:bookmarkStart w:id="119" w:name="refs"/>
-    <w:bookmarkStart w:id="22" w:name="ref-abbasi2011"/>
+    <w:bookmarkStart w:id="125" w:name="refs"/>
+    <w:bookmarkStart w:id="28" w:name="ref-abbasi2011"/>
     <w:p>
       <w:pPr>
         <w:pStyle w:val="Bibliography"/>
@@ -831,7 +1204,7 @@
       <w:r>
         <w:t xml:space="preserve"> </w:t>
       </w:r>
-      <w:hyperlink r:id="rId21">
+      <w:hyperlink r:id="rId27">
         <w:r>
           <w:rPr>
             <w:rStyle w:val="Hyperlink"/>
@@ -840,8 +1213,8 @@
         </w:r>
       </w:hyperlink>
     </w:p>
-    <w:bookmarkEnd w:id="22"/>
-    <w:bookmarkStart w:id="24" w:name="ref-allison1987"/>
+    <w:bookmarkEnd w:id="28"/>
+    <w:bookmarkStart w:id="30" w:name="ref-allison1987"/>
     <w:p>
       <w:pPr>
         <w:pStyle w:val="Bibliography"/>
@@ -878,7 +1251,7 @@
       <w:r>
         <w:t xml:space="preserve"> </w:t>
       </w:r>
-      <w:hyperlink r:id="rId23">
+      <w:hyperlink r:id="rId29">
         <w:r>
           <w:rPr>
             <w:rStyle w:val="Hyperlink"/>
@@ -887,8 +1260,8 @@
         </w:r>
       </w:hyperlink>
     </w:p>
-    <w:bookmarkEnd w:id="24"/>
-    <w:bookmarkStart w:id="26" w:name="ref-allison1990"/>
+    <w:bookmarkEnd w:id="30"/>
+    <w:bookmarkStart w:id="32" w:name="ref-allison1990"/>
     <w:p>
       <w:pPr>
         <w:pStyle w:val="Bibliography"/>
@@ -925,7 +1298,7 @@
       <w:r>
         <w:t xml:space="preserve"> </w:t>
       </w:r>
-      <w:hyperlink r:id="rId25">
+      <w:hyperlink r:id="rId31">
         <w:r>
           <w:rPr>
             <w:rStyle w:val="Hyperlink"/>
@@ -934,8 +1307,8 @@
         </w:r>
       </w:hyperlink>
     </w:p>
-    <w:bookmarkEnd w:id="26"/>
-    <w:bookmarkStart w:id="28" w:name="ref-barabasi1999"/>
+    <w:bookmarkEnd w:id="32"/>
+    <w:bookmarkStart w:id="34" w:name="ref-barabasi1999"/>
     <w:p>
       <w:pPr>
         <w:pStyle w:val="Bibliography"/>
@@ -972,7 +1345,7 @@
       <w:r>
         <w:t xml:space="preserve"> </w:t>
       </w:r>
-      <w:hyperlink r:id="rId27">
+      <w:hyperlink r:id="rId33">
         <w:r>
           <w:rPr>
             <w:rStyle w:val="Hyperlink"/>
@@ -981,8 +1354,8 @@
         </w:r>
       </w:hyperlink>
     </w:p>
-    <w:bookmarkEnd w:id="28"/>
-    <w:bookmarkStart w:id="30" w:name="ref-barrios2013"/>
+    <w:bookmarkEnd w:id="34"/>
+    <w:bookmarkStart w:id="36" w:name="ref-barrios2013"/>
     <w:p>
       <w:pPr>
         <w:pStyle w:val="Bibliography"/>
@@ -1019,7 +1392,7 @@
       <w:r>
         <w:t xml:space="preserve"> </w:t>
       </w:r>
-      <w:hyperlink r:id="rId29">
+      <w:hyperlink r:id="rId35">
         <w:r>
           <w:rPr>
             <w:rStyle w:val="Hyperlink"/>
@@ -1028,8 +1401,8 @@
         </w:r>
       </w:hyperlink>
     </w:p>
-    <w:bookmarkEnd w:id="30"/>
-    <w:bookmarkStart w:id="32" w:name="ref-block2019"/>
+    <w:bookmarkEnd w:id="36"/>
+    <w:bookmarkStart w:id="38" w:name="ref-block2019"/>
     <w:p>
       <w:pPr>
         <w:pStyle w:val="Bibliography"/>
@@ -1096,7 +1469,7 @@
       <w:r>
         <w:t xml:space="preserve"> </w:t>
       </w:r>
-      <w:hyperlink r:id="rId31">
+      <w:hyperlink r:id="rId37">
         <w:r>
           <w:rPr>
             <w:rStyle w:val="Hyperlink"/>
@@ -1105,8 +1478,8 @@
         </w:r>
       </w:hyperlink>
     </w:p>
-    <w:bookmarkEnd w:id="32"/>
-    <w:bookmarkStart w:id="34" w:name="ref-bojanowski2020"/>
+    <w:bookmarkEnd w:id="38"/>
+    <w:bookmarkStart w:id="40" w:name="ref-bojanowski2020"/>
     <w:p>
       <w:pPr>
         <w:pStyle w:val="Bibliography"/>
@@ -1155,7 +1528,7 @@
       <w:r>
         <w:t xml:space="preserve"> </w:t>
       </w:r>
-      <w:hyperlink r:id="rId33">
+      <w:hyperlink r:id="rId39">
         <w:r>
           <w:rPr>
             <w:rStyle w:val="Hyperlink"/>
@@ -1164,8 +1537,8 @@
         </w:r>
       </w:hyperlink>
     </w:p>
-    <w:bookmarkEnd w:id="34"/>
-    <w:bookmarkStart w:id="36" w:name="ref-bol2023"/>
+    <w:bookmarkEnd w:id="40"/>
+    <w:bookmarkStart w:id="42" w:name="ref-bol2023"/>
     <w:p>
       <w:pPr>
         <w:pStyle w:val="Bibliography"/>
@@ -1214,7 +1587,7 @@
       <w:r>
         <w:t xml:space="preserve"> </w:t>
       </w:r>
-      <w:hyperlink r:id="rId35">
+      <w:hyperlink r:id="rId41">
         <w:r>
           <w:rPr>
             <w:rStyle w:val="Hyperlink"/>
@@ -1223,8 +1596,8 @@
         </w:r>
       </w:hyperlink>
     </w:p>
-    <w:bookmarkEnd w:id="36"/>
-    <w:bookmarkStart w:id="38" w:name="ref-burt1998"/>
+    <w:bookmarkEnd w:id="42"/>
+    <w:bookmarkStart w:id="44" w:name="ref-burt1998"/>
     <w:p>
       <w:pPr>
         <w:pStyle w:val="Bibliography"/>
@@ -1261,7 +1634,7 @@
       <w:r>
         <w:t xml:space="preserve"> </w:t>
       </w:r>
-      <w:hyperlink r:id="rId37">
+      <w:hyperlink r:id="rId43">
         <w:r>
           <w:rPr>
             <w:rStyle w:val="Hyperlink"/>
@@ -1270,8 +1643,8 @@
         </w:r>
       </w:hyperlink>
     </w:p>
-    <w:bookmarkEnd w:id="38"/>
-    <w:bookmarkStart w:id="40" w:name="ref-cabay2018"/>
+    <w:bookmarkEnd w:id="44"/>
+    <w:bookmarkStart w:id="46" w:name="ref-cabay2018"/>
     <w:p>
       <w:pPr>
         <w:pStyle w:val="Bibliography"/>
@@ -1368,7 +1741,7 @@
       <w:r>
         <w:t xml:space="preserve"> </w:t>
       </w:r>
-      <w:hyperlink r:id="rId39">
+      <w:hyperlink r:id="rId45">
         <w:r>
           <w:rPr>
             <w:rStyle w:val="Hyperlink"/>
@@ -1377,8 +1750,8 @@
         </w:r>
       </w:hyperlink>
     </w:p>
-    <w:bookmarkEnd w:id="40"/>
-    <w:bookmarkStart w:id="42" w:name="ref-cespedes2025"/>
+    <w:bookmarkEnd w:id="46"/>
+    <w:bookmarkStart w:id="48" w:name="ref-cespedes2025"/>
     <w:p>
       <w:pPr>
         <w:pStyle w:val="Bibliography"/>
@@ -1436,7 +1809,7 @@
       <w:r>
         <w:t xml:space="preserve"> </w:t>
       </w:r>
-      <w:hyperlink r:id="rId41">
+      <w:hyperlink r:id="rId47">
         <w:r>
           <w:rPr>
             <w:rStyle w:val="Hyperlink"/>
@@ -1445,8 +1818,8 @@
         </w:r>
       </w:hyperlink>
     </w:p>
-    <w:bookmarkEnd w:id="42"/>
-    <w:bookmarkStart w:id="44" w:name="ref-collischon2021a"/>
+    <w:bookmarkEnd w:id="48"/>
+    <w:bookmarkStart w:id="50" w:name="ref-collischon2021a"/>
     <w:p>
       <w:pPr>
         <w:pStyle w:val="Bibliography"/>
@@ -1483,7 +1856,7 @@
       <w:r>
         <w:t xml:space="preserve"> </w:t>
       </w:r>
-      <w:hyperlink r:id="rId43">
+      <w:hyperlink r:id="rId49">
         <w:r>
           <w:rPr>
             <w:rStyle w:val="Hyperlink"/>
@@ -1492,8 +1865,8 @@
         </w:r>
       </w:hyperlink>
     </w:p>
-    <w:bookmarkEnd w:id="44"/>
-    <w:bookmarkStart w:id="46" w:name="ref-contreras2025"/>
+    <w:bookmarkEnd w:id="50"/>
+    <w:bookmarkStart w:id="52" w:name="ref-contreras2025"/>
     <w:p>
       <w:pPr>
         <w:pStyle w:val="Bibliography"/>
@@ -1551,7 +1924,7 @@
       <w:r>
         <w:t xml:space="preserve"> </w:t>
       </w:r>
-      <w:hyperlink r:id="rId45">
+      <w:hyperlink r:id="rId51">
         <w:r>
           <w:rPr>
             <w:rStyle w:val="Hyperlink"/>
@@ -1560,8 +1933,8 @@
         </w:r>
       </w:hyperlink>
     </w:p>
-    <w:bookmarkEnd w:id="46"/>
-    <w:bookmarkStart w:id="47" w:name="ref-crenshaw1989"/>
+    <w:bookmarkEnd w:id="52"/>
+    <w:bookmarkStart w:id="53" w:name="ref-crenshaw1989"/>
     <w:p>
       <w:pPr>
         <w:pStyle w:val="Bibliography"/>
@@ -1608,8 +1981,8 @@
         <w:t xml:space="preserve">, 139–167.</w:t>
       </w:r>
     </w:p>
-    <w:bookmarkEnd w:id="47"/>
-    <w:bookmarkStart w:id="49" w:name="ref-ductor2015"/>
+    <w:bookmarkEnd w:id="53"/>
+    <w:bookmarkStart w:id="55" w:name="ref-ductor2015"/>
     <w:p>
       <w:pPr>
         <w:pStyle w:val="Bibliography"/>
@@ -1667,7 +2040,7 @@
       <w:r>
         <w:t xml:space="preserve"> </w:t>
       </w:r>
-      <w:hyperlink r:id="rId48">
+      <w:hyperlink r:id="rId54">
         <w:r>
           <w:rPr>
             <w:rStyle w:val="Hyperlink"/>
@@ -1676,8 +2049,8 @@
         </w:r>
       </w:hyperlink>
     </w:p>
-    <w:bookmarkEnd w:id="49"/>
-    <w:bookmarkStart w:id="51" w:name="ref-ebadi2015"/>
+    <w:bookmarkEnd w:id="55"/>
+    <w:bookmarkStart w:id="57" w:name="ref-ebadi2015"/>
     <w:p>
       <w:pPr>
         <w:pStyle w:val="Bibliography"/>
@@ -1714,7 +2087,7 @@
       <w:r>
         <w:t xml:space="preserve"> </w:t>
       </w:r>
-      <w:hyperlink r:id="rId50">
+      <w:hyperlink r:id="rId56">
         <w:r>
           <w:rPr>
             <w:rStyle w:val="Hyperlink"/>
@@ -1723,8 +2096,8 @@
         </w:r>
       </w:hyperlink>
     </w:p>
-    <w:bookmarkEnd w:id="51"/>
-    <w:bookmarkStart w:id="53" w:name="ref-ferligoj2015"/>
+    <w:bookmarkEnd w:id="57"/>
+    <w:bookmarkStart w:id="59" w:name="ref-ferligoj2015"/>
     <w:p>
       <w:pPr>
         <w:pStyle w:val="Bibliography"/>
@@ -1761,7 +2134,7 @@
       <w:r>
         <w:t xml:space="preserve"> </w:t>
       </w:r>
-      <w:hyperlink r:id="rId52">
+      <w:hyperlink r:id="rId58">
         <w:r>
           <w:rPr>
             <w:rStyle w:val="Hyperlink"/>
@@ -1770,8 +2143,8 @@
         </w:r>
       </w:hyperlink>
     </w:p>
-    <w:bookmarkEnd w:id="53"/>
-    <w:bookmarkStart w:id="55" w:name="ref-gao2022"/>
+    <w:bookmarkEnd w:id="59"/>
+    <w:bookmarkStart w:id="61" w:name="ref-gao2022"/>
     <w:p>
       <w:pPr>
         <w:pStyle w:val="Bibliography"/>
@@ -1820,7 +2193,7 @@
       <w:r>
         <w:t xml:space="preserve"> </w:t>
       </w:r>
-      <w:hyperlink r:id="rId54">
+      <w:hyperlink r:id="rId60">
         <w:r>
           <w:rPr>
             <w:rStyle w:val="Hyperlink"/>
@@ -1829,8 +2202,8 @@
         </w:r>
       </w:hyperlink>
     </w:p>
-    <w:bookmarkEnd w:id="55"/>
-    <w:bookmarkStart w:id="57" w:name="ref-gondal2011"/>
+    <w:bookmarkEnd w:id="61"/>
+    <w:bookmarkStart w:id="63" w:name="ref-gondal2011"/>
     <w:p>
       <w:pPr>
         <w:pStyle w:val="Bibliography"/>
@@ -1879,7 +2252,7 @@
       <w:r>
         <w:t xml:space="preserve"> </w:t>
       </w:r>
-      <w:hyperlink r:id="rId56">
+      <w:hyperlink r:id="rId62">
         <w:r>
           <w:rPr>
             <w:rStyle w:val="Hyperlink"/>
@@ -1888,8 +2261,8 @@
         </w:r>
       </w:hyperlink>
     </w:p>
-    <w:bookmarkEnd w:id="57"/>
-    <w:bookmarkStart w:id="59" w:name="ref-gondal2018"/>
+    <w:bookmarkEnd w:id="63"/>
+    <w:bookmarkStart w:id="65" w:name="ref-gondal2018"/>
     <w:p>
       <w:pPr>
         <w:pStyle w:val="Bibliography"/>
@@ -1956,7 +2329,7 @@
       <w:r>
         <w:t xml:space="preserve"> </w:t>
       </w:r>
-      <w:hyperlink r:id="rId58">
+      <w:hyperlink r:id="rId64">
         <w:r>
           <w:rPr>
             <w:rStyle w:val="Hyperlink"/>
@@ -1965,8 +2338,8 @@
         </w:r>
       </w:hyperlink>
     </w:p>
-    <w:bookmarkEnd w:id="59"/>
-    <w:bookmarkStart w:id="61" w:name="ref-greska2023"/>
+    <w:bookmarkEnd w:id="65"/>
+    <w:bookmarkStart w:id="67" w:name="ref-greska2023"/>
     <w:p>
       <w:pPr>
         <w:pStyle w:val="Bibliography"/>
@@ -2024,7 +2397,7 @@
       <w:r>
         <w:t xml:space="preserve"> </w:t>
       </w:r>
-      <w:hyperlink r:id="rId60">
+      <w:hyperlink r:id="rId66">
         <w:r>
           <w:rPr>
             <w:rStyle w:val="Hyperlink"/>
@@ -2033,8 +2406,8 @@
         </w:r>
       </w:hyperlink>
     </w:p>
-    <w:bookmarkEnd w:id="61"/>
-    <w:bookmarkStart w:id="63" w:name="ref-hancean2014"/>
+    <w:bookmarkEnd w:id="67"/>
+    <w:bookmarkStart w:id="69" w:name="ref-hancean2014"/>
     <w:p>
       <w:pPr>
         <w:pStyle w:val="Bibliography"/>
@@ -2113,7 +2486,7 @@
       <w:r>
         <w:t xml:space="preserve"> </w:t>
       </w:r>
-      <w:hyperlink r:id="rId62">
+      <w:hyperlink r:id="rId68">
         <w:r>
           <w:rPr>
             <w:rStyle w:val="Hyperlink"/>
@@ -2122,8 +2495,8 @@
         </w:r>
       </w:hyperlink>
     </w:p>
-    <w:bookmarkEnd w:id="63"/>
-    <w:bookmarkStart w:id="65" w:name="ref-hofstra2020"/>
+    <w:bookmarkEnd w:id="69"/>
+    <w:bookmarkStart w:id="71" w:name="ref-hofstra2020"/>
     <w:p>
       <w:pPr>
         <w:pStyle w:val="Bibliography"/>
@@ -2187,7 +2560,7 @@
       <w:r>
         <w:t xml:space="preserve"> </w:t>
       </w:r>
-      <w:hyperlink r:id="rId64">
+      <w:hyperlink r:id="rId70">
         <w:r>
           <w:rPr>
             <w:rStyle w:val="Hyperlink"/>
@@ -2196,8 +2569,8 @@
         </w:r>
       </w:hyperlink>
     </w:p>
-    <w:bookmarkEnd w:id="65"/>
-    <w:bookmarkStart w:id="67" w:name="ref-hofstra2022"/>
+    <w:bookmarkEnd w:id="71"/>
+    <w:bookmarkStart w:id="73" w:name="ref-hofstra2022"/>
     <w:p>
       <w:pPr>
         <w:pStyle w:val="Bibliography"/>
@@ -2243,7 +2616,7 @@
       <w:r>
         <w:t xml:space="preserve"> </w:t>
       </w:r>
-      <w:hyperlink r:id="rId66">
+      <w:hyperlink r:id="rId72">
         <w:r>
           <w:rPr>
             <w:rStyle w:val="Hyperlink"/>
@@ -2252,8 +2625,8 @@
         </w:r>
       </w:hyperlink>
     </w:p>
-    <w:bookmarkEnd w:id="67"/>
-    <w:bookmarkStart w:id="69" w:name="ref-hou2007"/>
+    <w:bookmarkEnd w:id="73"/>
+    <w:bookmarkStart w:id="75" w:name="ref-hou2007"/>
     <w:p>
       <w:pPr>
         <w:pStyle w:val="Bibliography"/>
@@ -2291,7 +2664,7 @@
       <w:r>
         <w:t xml:space="preserve"> </w:t>
       </w:r>
-      <w:hyperlink r:id="rId68">
+      <w:hyperlink r:id="rId74">
         <w:r>
           <w:rPr>
             <w:rStyle w:val="Hyperlink"/>
@@ -2300,8 +2673,8 @@
         </w:r>
       </w:hyperlink>
     </w:p>
-    <w:bookmarkEnd w:id="69"/>
-    <w:bookmarkStart w:id="71" w:name="ref-khor2016"/>
+    <w:bookmarkEnd w:id="75"/>
+    <w:bookmarkStart w:id="77" w:name="ref-khor2016"/>
     <w:p>
       <w:pPr>
         <w:pStyle w:val="Bibliography"/>
@@ -2338,7 +2711,7 @@
       <w:r>
         <w:t xml:space="preserve"> </w:t>
       </w:r>
-      <w:hyperlink r:id="rId70">
+      <w:hyperlink r:id="rId76">
         <w:r>
           <w:rPr>
             <w:rStyle w:val="Hyperlink"/>
@@ -2347,8 +2720,8 @@
         </w:r>
       </w:hyperlink>
     </w:p>
-    <w:bookmarkEnd w:id="71"/>
-    <w:bookmarkStart w:id="73" w:name="ref-kim2024"/>
+    <w:bookmarkEnd w:id="77"/>
+    <w:bookmarkStart w:id="79" w:name="ref-kim2024"/>
     <w:p>
       <w:pPr>
         <w:pStyle w:val="Bibliography"/>
@@ -2394,7 +2767,7 @@
       <w:r>
         <w:t xml:space="preserve"> </w:t>
       </w:r>
-      <w:hyperlink r:id="rId72">
+      <w:hyperlink r:id="rId78">
         <w:r>
           <w:rPr>
             <w:rStyle w:val="Hyperlink"/>
@@ -2403,8 +2776,8 @@
         </w:r>
       </w:hyperlink>
     </w:p>
-    <w:bookmarkEnd w:id="73"/>
-    <w:bookmarkStart w:id="75" w:name="ref-kim2016"/>
+    <w:bookmarkEnd w:id="79"/>
+    <w:bookmarkStart w:id="81" w:name="ref-kim2016"/>
     <w:p>
       <w:pPr>
         <w:pStyle w:val="Bibliography"/>
@@ -2453,7 +2826,7 @@
       <w:r>
         <w:t xml:space="preserve"> </w:t>
       </w:r>
-      <w:hyperlink r:id="rId74">
+      <w:hyperlink r:id="rId80">
         <w:r>
           <w:rPr>
             <w:rStyle w:val="Hyperlink"/>
@@ -2462,8 +2835,8 @@
         </w:r>
       </w:hyperlink>
     </w:p>
-    <w:bookmarkEnd w:id="75"/>
-    <w:bookmarkStart w:id="77" w:name="ref-kim2022"/>
+    <w:bookmarkEnd w:id="81"/>
+    <w:bookmarkStart w:id="83" w:name="ref-kim2022"/>
     <w:p>
       <w:pPr>
         <w:pStyle w:val="Bibliography"/>
@@ -2500,7 +2873,7 @@
       <w:r>
         <w:t xml:space="preserve"> </w:t>
       </w:r>
-      <w:hyperlink r:id="rId76">
+      <w:hyperlink r:id="rId82">
         <w:r>
           <w:rPr>
             <w:rStyle w:val="Hyperlink"/>
@@ -2509,8 +2882,8 @@
         </w:r>
       </w:hyperlink>
     </w:p>
-    <w:bookmarkEnd w:id="77"/>
-    <w:bookmarkStart w:id="79" w:name="ref-king1988"/>
+    <w:bookmarkEnd w:id="83"/>
+    <w:bookmarkStart w:id="85" w:name="ref-king1988"/>
     <w:p>
       <w:pPr>
         <w:pStyle w:val="Bibliography"/>
@@ -2559,7 +2932,7 @@
       <w:r>
         <w:t xml:space="preserve"> </w:t>
       </w:r>
-      <w:hyperlink r:id="rId78">
+      <w:hyperlink r:id="rId84">
         <w:r>
           <w:rPr>
             <w:rStyle w:val="Hyperlink"/>
@@ -2568,8 +2941,8 @@
         </w:r>
       </w:hyperlink>
     </w:p>
-    <w:bookmarkEnd w:id="79"/>
-    <w:bookmarkStart w:id="81" w:name="ref-kozlowski2022"/>
+    <w:bookmarkEnd w:id="85"/>
+    <w:bookmarkStart w:id="87" w:name="ref-kozlowski2022"/>
     <w:p>
       <w:pPr>
         <w:pStyle w:val="Bibliography"/>
@@ -2606,7 +2979,7 @@
       <w:r>
         <w:t xml:space="preserve"> </w:t>
       </w:r>
-      <w:hyperlink r:id="rId80">
+      <w:hyperlink r:id="rId86">
         <w:r>
           <w:rPr>
             <w:rStyle w:val="Hyperlink"/>
@@ -2615,8 +2988,8 @@
         </w:r>
       </w:hyperlink>
     </w:p>
-    <w:bookmarkEnd w:id="81"/>
-    <w:bookmarkStart w:id="83" w:name="ref-kwiek2021"/>
+    <w:bookmarkEnd w:id="87"/>
+    <w:bookmarkStart w:id="89" w:name="ref-kwiek2021"/>
     <w:p>
       <w:pPr>
         <w:pStyle w:val="Bibliography"/>
@@ -2695,7 +3068,7 @@
       <w:r>
         <w:t xml:space="preserve"> </w:t>
       </w:r>
-      <w:hyperlink r:id="rId82">
+      <w:hyperlink r:id="rId88">
         <w:r>
           <w:rPr>
             <w:rStyle w:val="Hyperlink"/>
@@ -2704,8 +3077,8 @@
         </w:r>
       </w:hyperlink>
     </w:p>
-    <w:bookmarkEnd w:id="83"/>
-    <w:bookmarkStart w:id="85" w:name="ref-lalanne2022"/>
+    <w:bookmarkEnd w:id="89"/>
+    <w:bookmarkStart w:id="91" w:name="ref-lalanne2022"/>
     <w:p>
       <w:pPr>
         <w:pStyle w:val="Bibliography"/>
@@ -2742,7 +3115,7 @@
       <w:r>
         <w:t xml:space="preserve"> </w:t>
       </w:r>
-      <w:hyperlink r:id="rId84">
+      <w:hyperlink r:id="rId90">
         <w:r>
           <w:rPr>
             <w:rStyle w:val="Hyperlink"/>
@@ -2751,8 +3124,8 @@
         </w:r>
       </w:hyperlink>
     </w:p>
-    <w:bookmarkEnd w:id="85"/>
-    <w:bookmarkStart w:id="87" w:name="ref-li2022"/>
+    <w:bookmarkEnd w:id="91"/>
+    <w:bookmarkStart w:id="93" w:name="ref-li2022"/>
     <w:p>
       <w:pPr>
         <w:pStyle w:val="Bibliography"/>
@@ -2789,7 +3162,7 @@
       <w:r>
         <w:t xml:space="preserve"> </w:t>
       </w:r>
-      <w:hyperlink r:id="rId86">
+      <w:hyperlink r:id="rId92">
         <w:r>
           <w:rPr>
             <w:rStyle w:val="Hyperlink"/>
@@ -2798,8 +3171,8 @@
         </w:r>
       </w:hyperlink>
     </w:p>
-    <w:bookmarkEnd w:id="87"/>
-    <w:bookmarkStart w:id="89" w:name="ref-lutter2016"/>
+    <w:bookmarkEnd w:id="93"/>
+    <w:bookmarkStart w:id="95" w:name="ref-lutter2016"/>
     <w:p>
       <w:pPr>
         <w:pStyle w:val="Bibliography"/>
@@ -2860,7 +3233,7 @@
       <w:r>
         <w:t xml:space="preserve"> </w:t>
       </w:r>
-      <w:hyperlink r:id="rId88">
+      <w:hyperlink r:id="rId94">
         <w:r>
           <w:rPr>
             <w:rStyle w:val="Hyperlink"/>
@@ -2869,8 +3242,8 @@
         </w:r>
       </w:hyperlink>
     </w:p>
-    <w:bookmarkEnd w:id="89"/>
-    <w:bookmarkStart w:id="90" w:name="ref-merton1973"/>
+    <w:bookmarkEnd w:id="95"/>
+    <w:bookmarkStart w:id="96" w:name="ref-merton1973"/>
     <w:p>
       <w:pPr>
         <w:pStyle w:val="Bibliography"/>
@@ -2920,8 +3293,8 @@
         <w:t xml:space="preserve">. The University of Chicago Press.</w:t>
       </w:r>
     </w:p>
-    <w:bookmarkEnd w:id="90"/>
-    <w:bookmarkStart w:id="92" w:name="ref-moody2004"/>
+    <w:bookmarkEnd w:id="96"/>
+    <w:bookmarkStart w:id="98" w:name="ref-moody2004"/>
     <w:p>
       <w:pPr>
         <w:pStyle w:val="Bibliography"/>
@@ -2958,7 +3331,7 @@
       <w:r>
         <w:t xml:space="preserve"> </w:t>
       </w:r>
-      <w:hyperlink r:id="rId91">
+      <w:hyperlink r:id="rId97">
         <w:r>
           <w:rPr>
             <w:rStyle w:val="Hyperlink"/>
@@ -2967,8 +3340,8 @@
         </w:r>
       </w:hyperlink>
     </w:p>
-    <w:bookmarkEnd w:id="92"/>
-    <w:bookmarkStart w:id="94" w:name="ref-mulders2024"/>
+    <w:bookmarkEnd w:id="98"/>
+    <w:bookmarkStart w:id="100" w:name="ref-mulders2024"/>
     <w:p>
       <w:pPr>
         <w:pStyle w:val="Bibliography"/>
@@ -3032,7 +3405,7 @@
       <w:r>
         <w:t xml:space="preserve"> </w:t>
       </w:r>
-      <w:hyperlink r:id="rId93">
+      <w:hyperlink r:id="rId99">
         <w:r>
           <w:rPr>
             <w:rStyle w:val="Hyperlink"/>
@@ -3041,8 +3414,8 @@
         </w:r>
       </w:hyperlink>
     </w:p>
-    <w:bookmarkEnd w:id="94"/>
-    <w:bookmarkStart w:id="96" w:name="ref-newman2001"/>
+    <w:bookmarkEnd w:id="100"/>
+    <w:bookmarkStart w:id="102" w:name="ref-newman2001"/>
     <w:p>
       <w:pPr>
         <w:pStyle w:val="Bibliography"/>
@@ -3079,7 +3452,7 @@
       <w:r>
         <w:t xml:space="preserve"> </w:t>
       </w:r>
-      <w:hyperlink r:id="rId95">
+      <w:hyperlink r:id="rId101">
         <w:r>
           <w:rPr>
             <w:rStyle w:val="Hyperlink"/>
@@ -3088,8 +3461,8 @@
         </w:r>
       </w:hyperlink>
     </w:p>
-    <w:bookmarkEnd w:id="96"/>
-    <w:bookmarkStart w:id="98" w:name="ref-ossenblok2014"/>
+    <w:bookmarkEnd w:id="102"/>
+    <w:bookmarkStart w:id="104" w:name="ref-ossenblok2014"/>
     <w:p>
       <w:pPr>
         <w:pStyle w:val="Bibliography"/>
@@ -3126,7 +3499,7 @@
       <w:r>
         <w:t xml:space="preserve"> </w:t>
       </w:r>
-      <w:hyperlink r:id="rId97">
+      <w:hyperlink r:id="rId103">
         <w:r>
           <w:rPr>
             <w:rStyle w:val="Hyperlink"/>
@@ -3135,8 +3508,8 @@
         </w:r>
       </w:hyperlink>
     </w:p>
-    <w:bookmarkEnd w:id="98"/>
-    <w:bookmarkStart w:id="100" w:name="ref-stadmark2020"/>
+    <w:bookmarkEnd w:id="104"/>
+    <w:bookmarkStart w:id="106" w:name="ref-stadmark2020"/>
     <w:p>
       <w:pPr>
         <w:pStyle w:val="Bibliography"/>
@@ -3187,7 +3560,7 @@
       <w:r>
         <w:t xml:space="preserve"> </w:t>
       </w:r>
-      <w:hyperlink r:id="rId99">
+      <w:hyperlink r:id="rId105">
         <w:r>
           <w:rPr>
             <w:rStyle w:val="Hyperlink"/>
@@ -3196,8 +3569,8 @@
         </w:r>
       </w:hyperlink>
     </w:p>
-    <w:bookmarkEnd w:id="100"/>
-    <w:bookmarkStart w:id="102" w:name="ref-stark2020"/>
+    <w:bookmarkEnd w:id="106"/>
+    <w:bookmarkStart w:id="108" w:name="ref-stark2020"/>
     <w:p>
       <w:pPr>
         <w:pStyle w:val="Bibliography"/>
@@ -3288,7 +3661,7 @@
       <w:r>
         <w:t xml:space="preserve"> </w:t>
       </w:r>
-      <w:hyperlink r:id="rId101">
+      <w:hyperlink r:id="rId107">
         <w:r>
           <w:rPr>
             <w:rStyle w:val="Hyperlink"/>
@@ -3297,8 +3670,8 @@
         </w:r>
       </w:hyperlink>
     </w:p>
-    <w:bookmarkEnd w:id="102"/>
-    <w:bookmarkStart w:id="104" w:name="ref-tolsma2025"/>
+    <w:bookmarkEnd w:id="108"/>
+    <w:bookmarkStart w:id="110" w:name="ref-tolsma2025"/>
     <w:p>
       <w:pPr>
         <w:pStyle w:val="Bibliography"/>
@@ -3346,7 +3719,7 @@
       <w:r>
         <w:t xml:space="preserve"> </w:t>
       </w:r>
-      <w:hyperlink r:id="rId103">
+      <w:hyperlink r:id="rId109">
         <w:r>
           <w:rPr>
             <w:rStyle w:val="Hyperlink"/>
@@ -3355,8 +3728,8 @@
         </w:r>
       </w:hyperlink>
     </w:p>
-    <w:bookmarkEnd w:id="104"/>
-    <w:bookmarkStart w:id="106" w:name="ref-vanderwal2021"/>
+    <w:bookmarkEnd w:id="110"/>
+    <w:bookmarkStart w:id="112" w:name="ref-vanderwal2021"/>
     <w:p>
       <w:pPr>
         <w:pStyle w:val="Bibliography"/>
@@ -3393,7 +3766,7 @@
       <w:r>
         <w:t xml:space="preserve"> </w:t>
       </w:r>
-      <w:hyperlink r:id="rId105">
+      <w:hyperlink r:id="rId111">
         <w:r>
           <w:rPr>
             <w:rStyle w:val="Hyperlink"/>
@@ -3402,8 +3775,8 @@
         </w:r>
       </w:hyperlink>
     </w:p>
-    <w:bookmarkEnd w:id="106"/>
-    <w:bookmarkStart w:id="108" w:name="ref-wallace2012"/>
+    <w:bookmarkEnd w:id="112"/>
+    <w:bookmarkStart w:id="114" w:name="ref-wallace2012"/>
     <w:p>
       <w:pPr>
         <w:pStyle w:val="Bibliography"/>
@@ -3452,7 +3825,7 @@
       <w:r>
         <w:t xml:space="preserve"> </w:t>
       </w:r>
-      <w:hyperlink r:id="rId107">
+      <w:hyperlink r:id="rId113">
         <w:r>
           <w:rPr>
             <w:rStyle w:val="Hyperlink"/>
@@ -3461,8 +3834,8 @@
         </w:r>
       </w:hyperlink>
     </w:p>
-    <w:bookmarkEnd w:id="108"/>
-    <w:bookmarkStart w:id="110" w:name="ref-whittington2018"/>
+    <w:bookmarkEnd w:id="114"/>
+    <w:bookmarkStart w:id="116" w:name="ref-whittington2018"/>
     <w:p>
       <w:pPr>
         <w:pStyle w:val="Bibliography"/>
@@ -3526,7 +3899,7 @@
       <w:r>
         <w:t xml:space="preserve"> </w:t>
       </w:r>
-      <w:hyperlink r:id="rId109">
+      <w:hyperlink r:id="rId115">
         <w:r>
           <w:rPr>
             <w:rStyle w:val="Hyperlink"/>
@@ -3535,8 +3908,8 @@
         </w:r>
       </w:hyperlink>
     </w:p>
-    <w:bookmarkEnd w:id="110"/>
-    <w:bookmarkStart w:id="112" w:name="ref-whittington2024"/>
+    <w:bookmarkEnd w:id="116"/>
+    <w:bookmarkStart w:id="118" w:name="ref-whittington2024"/>
     <w:p>
       <w:pPr>
         <w:pStyle w:val="Bibliography"/>
@@ -3573,7 +3946,7 @@
       <w:r>
         <w:t xml:space="preserve"> </w:t>
       </w:r>
-      <w:hyperlink r:id="rId111">
+      <w:hyperlink r:id="rId117">
         <w:r>
           <w:rPr>
             <w:rStyle w:val="Hyperlink"/>
@@ -3582,8 +3955,8 @@
         </w:r>
       </w:hyperlink>
     </w:p>
-    <w:bookmarkEnd w:id="112"/>
-    <w:bookmarkStart w:id="114" w:name="ref-woehler2021"/>
+    <w:bookmarkEnd w:id="118"/>
+    <w:bookmarkStart w:id="120" w:name="ref-woehler2021"/>
     <w:p>
       <w:pPr>
         <w:pStyle w:val="Bibliography"/>
@@ -3632,7 +4005,7 @@
       <w:r>
         <w:t xml:space="preserve"> </w:t>
       </w:r>
-      <w:hyperlink r:id="rId113">
+      <w:hyperlink r:id="rId119">
         <w:r>
           <w:rPr>
             <w:rStyle w:val="Hyperlink"/>
@@ -3641,8 +4014,8 @@
         </w:r>
       </w:hyperlink>
     </w:p>
-    <w:bookmarkEnd w:id="114"/>
-    <w:bookmarkStart w:id="116" w:name="ref-wu2019"/>
+    <w:bookmarkEnd w:id="120"/>
+    <w:bookmarkStart w:id="122" w:name="ref-wu2019"/>
     <w:p>
       <w:pPr>
         <w:pStyle w:val="Bibliography"/>
@@ -3679,7 +4052,7 @@
       <w:r>
         <w:t xml:space="preserve"> </w:t>
       </w:r>
-      <w:hyperlink r:id="rId115">
+      <w:hyperlink r:id="rId121">
         <w:r>
           <w:rPr>
             <w:rStyle w:val="Hyperlink"/>
@@ -3688,8 +4061,8 @@
         </w:r>
       </w:hyperlink>
     </w:p>
-    <w:bookmarkEnd w:id="116"/>
-    <w:bookmarkStart w:id="118" w:name="ref-zheng2025"/>
+    <w:bookmarkEnd w:id="122"/>
+    <w:bookmarkStart w:id="124" w:name="ref-zheng2025"/>
     <w:p>
       <w:pPr>
         <w:pStyle w:val="Bibliography"/>
@@ -3756,7 +4129,7 @@
       <w:r>
         <w:t xml:space="preserve"> </w:t>
       </w:r>
-      <w:hyperlink r:id="rId117">
+      <w:hyperlink r:id="rId123">
         <w:r>
           <w:rPr>
             <w:rStyle w:val="Hyperlink"/>
@@ -3765,13 +4138,13 @@
         </w:r>
       </w:hyperlink>
     </w:p>
-    <w:bookmarkEnd w:id="118"/>
-    <w:bookmarkEnd w:id="119"/>
-    <w:bookmarkEnd w:id="120"/>
+    <w:bookmarkEnd w:id="124"/>
+    <w:bookmarkEnd w:id="125"/>
+    <w:bookmarkEnd w:id="126"/>
     <w:sectPr>
-      <w:footnotePr>
-        <w:numRestart w:val="eachSect"/>
-      </w:footnotePr>
+      <w:pgSz w:h="15840" w:w="12240"/>
+      <w:pgMar w:bottom="1440" w:footer="720" w:gutter="0" w:header="720" w:left="1440" w:right="1440" w:top="1440"/>
+      <w:cols w:space="720"/>
     </w:sectPr>
   </w:body>
 </w:document>
@@ -3801,7 +4174,296 @@
 </file>
 
 <file path=word/numbering.xml><?xml version="1.0" encoding="utf-8"?>
-<w:numbering xmlns:w="http://schemas.openxmlformats.org/wordprocessingml/2006/main">
+<w:numbering xmlns:aink="http://schemas.microsoft.com/office/drawing/2016/ink" xmlns:am3d="http://schemas.microsoft.com/office/drawing/2017/model3d" xmlns:cx="http://schemas.microsoft.com/office/drawing/2014/chartex" xmlns:cx1="http://schemas.microsoft.com/office/drawing/2015/9/8/chartex" xmlns:cx2="http://schemas.microsoft.com/office/drawing/2015/10/21/chartex" xmlns:cx3="http://schemas.microsoft.com/office/drawing/2016/5/9/chartex" xmlns:cx4="http://schemas.microsoft.com/office/drawing/2016/5/10/chartex" xmlns:cx5="http://schemas.microsoft.com/office/drawing/2016/5/11/chartex" xmlns:cx6="http://schemas.microsoft.com/office/drawing/2016/5/12/chartex" xmlns:cx7="http://schemas.microsoft.com/office/drawing/2016/5/13/chartex" xmlns:cx8="http://schemas.microsoft.com/office/drawing/2016/5/14/chartex" xmlns:m="http://schemas.openxmlformats.org/officeDocument/2006/math" xmlns:mc="http://schemas.openxmlformats.org/markup-compatibility/2006" xmlns:o="urn:schemas-microsoft-com:office:office" xmlns:oel="http://schemas.microsoft.com/office/2019/extlst" xmlns:r="http://schemas.openxmlformats.org/officeDocument/2006/relationships" xmlns:v="urn:schemas-microsoft-com:vml" xmlns:w="http://schemas.openxmlformats.org/wordprocessingml/2006/main" xmlns:w10="urn:schemas-microsoft-com:office:word" xmlns:w14="http://schemas.microsoft.com/office/word/2010/wordml" xmlns:w15="http://schemas.microsoft.com/office/word/2012/wordml" xmlns:w16="http://schemas.microsoft.com/office/word/2018/wordml" xmlns:w16cex="http://schemas.microsoft.com/office/word/2018/wordml/cex" xmlns:w16cid="http://schemas.microsoft.com/office/word/2016/wordml/cid" xmlns:w16du="http://schemas.microsoft.com/office/word/2023/wordml/word16du" xmlns:w16sdtdh="http://schemas.microsoft.com/office/word/2020/wordml/sdtdatahash" xmlns:w16se="http://schemas.microsoft.com/office/word/2015/wordml/symex" xmlns:wne="http://schemas.microsoft.com/office/word/2006/wordml" xmlns:wp="http://schemas.openxmlformats.org/drawingml/2006/wordprocessingDrawing" xmlns:wp14="http://schemas.microsoft.com/office/word/2010/wordprocessingDrawing" xmlns:wpc="http://schemas.microsoft.com/office/word/2010/wordprocessingCanvas" xmlns:wpg="http://schemas.microsoft.com/office/word/2010/wordprocessingGroup" xmlns:wpi="http://schemas.microsoft.com/office/word/2010/wordprocessingInk" xmlns:wps="http://schemas.microsoft.com/office/word/2010/wordprocessingShape" mc:Ignorable="w14 w15 w16se w16cid w16 w16cex w16sdtdh w16du wp14">
+  <w:abstractNum w15:restartNumberingAfterBreak="0" w:abstractNumId="0">
+    <w:nsid w:val="FFFFFF7C"/>
+    <w:multiLevelType w:val="singleLevel"/>
+    <w:tmpl w:val="FAFE9ABA"/>
+    <w:lvl w:ilvl="0">
+      <w:start w:val="1"/>
+      <w:numFmt w:val="decimal"/>
+      <w:lvlText w:val="%1."/>
+      <w:lvlJc w:val="left"/>
+      <w:pPr>
+        <w:tabs>
+          <w:tab w:pos="1800" w:val="num"/>
+        </w:tabs>
+        <w:ind w:hanging="360" w:left="1800"/>
+      </w:pPr>
+    </w:lvl>
+  </w:abstractNum>
+  <w:abstractNum w15:restartNumberingAfterBreak="0" w:abstractNumId="1">
+    <w:nsid w:val="FFFFFF7D"/>
+    <w:multiLevelType w:val="singleLevel"/>
+    <w:tmpl w:val="399C72BC"/>
+    <w:lvl w:ilvl="0">
+      <w:start w:val="1"/>
+      <w:numFmt w:val="decimal"/>
+      <w:lvlText w:val="%1."/>
+      <w:lvlJc w:val="left"/>
+      <w:pPr>
+        <w:tabs>
+          <w:tab w:pos="1440" w:val="num"/>
+        </w:tabs>
+        <w:ind w:hanging="360" w:left="1440"/>
+      </w:pPr>
+    </w:lvl>
+  </w:abstractNum>
+  <w:abstractNum w15:restartNumberingAfterBreak="0" w:abstractNumId="2">
+    <w:nsid w:val="FFFFFF7E"/>
+    <w:multiLevelType w:val="singleLevel"/>
+    <w:tmpl w:val="134E0EF6"/>
+    <w:lvl w:ilvl="0">
+      <w:start w:val="1"/>
+      <w:numFmt w:val="decimal"/>
+      <w:lvlText w:val="%1."/>
+      <w:lvlJc w:val="left"/>
+      <w:pPr>
+        <w:tabs>
+          <w:tab w:pos="1080" w:val="num"/>
+        </w:tabs>
+        <w:ind w:hanging="360" w:left="1080"/>
+      </w:pPr>
+    </w:lvl>
+  </w:abstractNum>
+  <w:abstractNum w15:restartNumberingAfterBreak="0" w:abstractNumId="3">
+    <w:nsid w:val="FFFFFF7F"/>
+    <w:multiLevelType w:val="singleLevel"/>
+    <w:tmpl w:val="503C8C3E"/>
+    <w:lvl w:ilvl="0">
+      <w:start w:val="1"/>
+      <w:numFmt w:val="decimal"/>
+      <w:lvlText w:val="%1."/>
+      <w:lvlJc w:val="left"/>
+      <w:pPr>
+        <w:tabs>
+          <w:tab w:pos="720" w:val="num"/>
+        </w:tabs>
+        <w:ind w:hanging="360" w:left="720"/>
+      </w:pPr>
+    </w:lvl>
+  </w:abstractNum>
+  <w:abstractNum w15:restartNumberingAfterBreak="0" w:abstractNumId="4">
+    <w:nsid w:val="FFFFFF80"/>
+    <w:multiLevelType w:val="singleLevel"/>
+    <w:tmpl w:val="62D64704"/>
+    <w:lvl w:ilvl="0">
+      <w:start w:val="1"/>
+      <w:numFmt w:val="bullet"/>
+      <w:lvlText w:val=""/>
+      <w:lvlJc w:val="left"/>
+      <w:pPr>
+        <w:tabs>
+          <w:tab w:pos="1800" w:val="num"/>
+        </w:tabs>
+        <w:ind w:hanging="360" w:left="1800"/>
+      </w:pPr>
+      <w:rPr>
+        <w:rFonts w:ascii="Symbol" w:hAnsi="Symbol" w:hint="default"/>
+      </w:rPr>
+    </w:lvl>
+  </w:abstractNum>
+  <w:abstractNum w15:restartNumberingAfterBreak="0" w:abstractNumId="5">
+    <w:nsid w:val="FFFFFF81"/>
+    <w:multiLevelType w:val="singleLevel"/>
+    <w:tmpl w:val="C46E51F6"/>
+    <w:lvl w:ilvl="0">
+      <w:start w:val="1"/>
+      <w:numFmt w:val="bullet"/>
+      <w:lvlText w:val=""/>
+      <w:lvlJc w:val="left"/>
+      <w:pPr>
+        <w:tabs>
+          <w:tab w:pos="1440" w:val="num"/>
+        </w:tabs>
+        <w:ind w:hanging="360" w:left="1440"/>
+      </w:pPr>
+      <w:rPr>
+        <w:rFonts w:ascii="Symbol" w:hAnsi="Symbol" w:hint="default"/>
+      </w:rPr>
+    </w:lvl>
+  </w:abstractNum>
+  <w:abstractNum w15:restartNumberingAfterBreak="0" w:abstractNumId="6">
+    <w:nsid w:val="FFFFFF82"/>
+    <w:multiLevelType w:val="singleLevel"/>
+    <w:tmpl w:val="9B5E0786"/>
+    <w:lvl w:ilvl="0">
+      <w:start w:val="1"/>
+      <w:numFmt w:val="bullet"/>
+      <w:lvlText w:val=""/>
+      <w:lvlJc w:val="left"/>
+      <w:pPr>
+        <w:tabs>
+          <w:tab w:pos="1080" w:val="num"/>
+        </w:tabs>
+        <w:ind w:hanging="360" w:left="1080"/>
+      </w:pPr>
+      <w:rPr>
+        <w:rFonts w:ascii="Symbol" w:hAnsi="Symbol" w:hint="default"/>
+      </w:rPr>
+    </w:lvl>
+  </w:abstractNum>
+  <w:abstractNum w15:restartNumberingAfterBreak="0" w:abstractNumId="7">
+    <w:nsid w:val="FFFFFF83"/>
+    <w:multiLevelType w:val="singleLevel"/>
+    <w:tmpl w:val="151895C0"/>
+    <w:lvl w:ilvl="0">
+      <w:start w:val="1"/>
+      <w:numFmt w:val="bullet"/>
+      <w:lvlText w:val=""/>
+      <w:lvlJc w:val="left"/>
+      <w:pPr>
+        <w:tabs>
+          <w:tab w:pos="720" w:val="num"/>
+        </w:tabs>
+        <w:ind w:hanging="360" w:left="720"/>
+      </w:pPr>
+      <w:rPr>
+        <w:rFonts w:ascii="Symbol" w:hAnsi="Symbol" w:hint="default"/>
+      </w:rPr>
+    </w:lvl>
+  </w:abstractNum>
+  <w:abstractNum w15:restartNumberingAfterBreak="0" w:abstractNumId="8">
+    <w:nsid w:val="FFFFFF88"/>
+    <w:multiLevelType w:val="singleLevel"/>
+    <w:tmpl w:val="9D9284A6"/>
+    <w:lvl w:ilvl="0">
+      <w:start w:val="1"/>
+      <w:numFmt w:val="decimal"/>
+      <w:lvlText w:val="%1."/>
+      <w:lvlJc w:val="left"/>
+      <w:pPr>
+        <w:tabs>
+          <w:tab w:pos="360" w:val="num"/>
+        </w:tabs>
+        <w:ind w:hanging="360" w:left="360"/>
+      </w:pPr>
+    </w:lvl>
+  </w:abstractNum>
+  <w:abstractNum w15:restartNumberingAfterBreak="0" w:abstractNumId="9">
+    <w:nsid w:val="FFFFFF89"/>
+    <w:multiLevelType w:val="singleLevel"/>
+    <w:tmpl w:val="801418FA"/>
+    <w:lvl w:ilvl="0">
+      <w:start w:val="1"/>
+      <w:numFmt w:val="bullet"/>
+      <w:lvlText w:val=""/>
+      <w:lvlJc w:val="left"/>
+      <w:pPr>
+        <w:tabs>
+          <w:tab w:pos="360" w:val="num"/>
+        </w:tabs>
+        <w:ind w:hanging="360" w:left="360"/>
+      </w:pPr>
+      <w:rPr>
+        <w:rFonts w:ascii="Symbol" w:hAnsi="Symbol" w:hint="default"/>
+      </w:rPr>
+    </w:lvl>
+  </w:abstractNum>
+  <w:abstractNum w15:restartNumberingAfterBreak="0" w:abstractNumId="10">
+    <w:nsid w:val="170CD2DE"/>
+    <w:multiLevelType w:val="multilevel"/>
+    <w:tmpl w:val="302EAA86"/>
+    <w:lvl w:ilvl="0">
+      <w:numFmt w:val="bullet"/>
+      <w:lvlText w:val=" "/>
+      <w:lvlJc w:val="left"/>
+      <w:pPr>
+        <w:tabs>
+          <w:tab w:pos="0" w:val="num"/>
+        </w:tabs>
+        <w:ind w:hanging="480" w:left="480"/>
+      </w:pPr>
+    </w:lvl>
+    <w:lvl w:ilvl="1">
+      <w:numFmt w:val="bullet"/>
+      <w:lvlText w:val=" "/>
+      <w:lvlJc w:val="left"/>
+      <w:pPr>
+        <w:tabs>
+          <w:tab w:pos="720" w:val="num"/>
+        </w:tabs>
+        <w:ind w:hanging="480" w:left="1200"/>
+      </w:pPr>
+    </w:lvl>
+    <w:lvl w:ilvl="2">
+      <w:numFmt w:val="bullet"/>
+      <w:lvlText w:val=" "/>
+      <w:lvlJc w:val="left"/>
+      <w:pPr>
+        <w:tabs>
+          <w:tab w:pos="1440" w:val="num"/>
+        </w:tabs>
+        <w:ind w:hanging="480" w:left="1920"/>
+      </w:pPr>
+    </w:lvl>
+    <w:lvl w:ilvl="3">
+      <w:numFmt w:val="bullet"/>
+      <w:lvlText w:val=" "/>
+      <w:lvlJc w:val="left"/>
+      <w:pPr>
+        <w:tabs>
+          <w:tab w:pos="2160" w:val="num"/>
+        </w:tabs>
+        <w:ind w:hanging="480" w:left="2640"/>
+      </w:pPr>
+    </w:lvl>
+    <w:lvl w:ilvl="4">
+      <w:numFmt w:val="bullet"/>
+      <w:lvlText w:val=" "/>
+      <w:lvlJc w:val="left"/>
+      <w:pPr>
+        <w:tabs>
+          <w:tab w:pos="2880" w:val="num"/>
+        </w:tabs>
+        <w:ind w:hanging="480" w:left="3360"/>
+      </w:pPr>
+    </w:lvl>
+    <w:lvl w:ilvl="5">
+      <w:numFmt w:val="bullet"/>
+      <w:lvlText w:val=" "/>
+      <w:lvlJc w:val="left"/>
+      <w:pPr>
+        <w:tabs>
+          <w:tab w:pos="3600" w:val="num"/>
+        </w:tabs>
+        <w:ind w:hanging="480" w:left="4080"/>
+      </w:pPr>
+    </w:lvl>
+    <w:lvl w:ilvl="6">
+      <w:numFmt w:val="bullet"/>
+      <w:lvlText w:val=" "/>
+      <w:lvlJc w:val="left"/>
+      <w:pPr>
+        <w:tabs>
+          <w:tab w:pos="4320" w:val="num"/>
+        </w:tabs>
+        <w:ind w:hanging="480" w:left="4800"/>
+      </w:pPr>
+    </w:lvl>
+    <w:lvl w:ilvl="7">
+      <w:numFmt w:val="bullet"/>
+      <w:lvlText w:val=" "/>
+      <w:lvlJc w:val="left"/>
+      <w:pPr>
+        <w:tabs>
+          <w:tab w:pos="5040" w:val="num"/>
+        </w:tabs>
+        <w:ind w:hanging="480" w:left="5520"/>
+      </w:pPr>
+    </w:lvl>
+    <w:lvl w:ilvl="8">
+      <w:numFmt w:val="bullet"/>
+      <w:lvlText w:val=" "/>
+      <w:lvlJc w:val="left"/>
+      <w:pPr>
+        <w:tabs>
+          <w:tab w:pos="5760" w:val="num"/>
+        </w:tabs>
+        <w:ind w:hanging="480" w:left="6240"/>
+      </w:pPr>
+    </w:lvl>
+  </w:abstractNum>
   <w:abstractNum w:abstractNumId="990">
     <w:nsid w:val="0000A990"/>
     <w:multiLevelType w:val="multilevel"/>
@@ -3981,6 +4643,39 @@
       </w:rPr>
     </w:lvl>
   </w:abstractNum>
+  <w:num w16cid:durableId="1697265735" w:numId="1">
+    <w:abstractNumId w:val="10"/>
+  </w:num>
+  <w:num w16cid:durableId="1621572318" w:numId="2">
+    <w:abstractNumId w:val="0"/>
+  </w:num>
+  <w:num w16cid:durableId="1698038869" w:numId="3">
+    <w:abstractNumId w:val="1"/>
+  </w:num>
+  <w:num w16cid:durableId="1816601568" w:numId="4">
+    <w:abstractNumId w:val="2"/>
+  </w:num>
+  <w:num w16cid:durableId="1549143319" w:numId="5">
+    <w:abstractNumId w:val="3"/>
+  </w:num>
+  <w:num w16cid:durableId="1923370611" w:numId="6">
+    <w:abstractNumId w:val="8"/>
+  </w:num>
+  <w:num w16cid:durableId="1712731999" w:numId="7">
+    <w:abstractNumId w:val="4"/>
+  </w:num>
+  <w:num w16cid:durableId="1199927662" w:numId="8">
+    <w:abstractNumId w:val="5"/>
+  </w:num>
+  <w:num w16cid:durableId="368116615" w:numId="9">
+    <w:abstractNumId w:val="6"/>
+  </w:num>
+  <w:num w16cid:durableId="1819230131" w:numId="10">
+    <w:abstractNumId w:val="7"/>
+  </w:num>
+  <w:num w16cid:durableId="666782604" w:numId="11">
+    <w:abstractNumId w:val="9"/>
+  </w:num>
   <w:num w:numId="1000">
     <w:abstractNumId w:val="990"/>
   </w:num>
@@ -4002,11 +4697,17 @@
   <w:num w:numId="1006">
     <w:abstractNumId w:val="991"/>
   </w:num>
+  <w:num w:numId="1007">
+    <w:abstractNumId w:val="991"/>
+  </w:num>
+  <w:num w:numId="1008">
+    <w:abstractNumId w:val="991"/>
+  </w:num>
 </w:numbering>
 </file>
 
 <file path=word/styles.xml><?xml version="1.0" encoding="utf-8"?>
-<w:styles xmlns:r="http://schemas.openxmlformats.org/officeDocument/2006/relationships" xmlns:w="http://schemas.openxmlformats.org/wordprocessingml/2006/main">
+<w:styles xmlns:mc="http://schemas.openxmlformats.org/markup-compatibility/2006" xmlns:r="http://schemas.openxmlformats.org/officeDocument/2006/relationships" xmlns:w="http://schemas.openxmlformats.org/wordprocessingml/2006/main" xmlns:w14="http://schemas.microsoft.com/office/word/2010/wordml" xmlns:w15="http://schemas.microsoft.com/office/word/2012/wordml" xmlns:w16="http://schemas.microsoft.com/office/word/2018/wordml" xmlns:w16cex="http://schemas.microsoft.com/office/word/2018/wordml/cex" xmlns:w16cid="http://schemas.microsoft.com/office/word/2016/wordml/cid" xmlns:w16du="http://schemas.microsoft.com/office/word/2023/wordml/word16du" xmlns:w16sdtdh="http://schemas.microsoft.com/office/word/2020/wordml/sdtdatahash" xmlns:w16se="http://schemas.microsoft.com/office/word/2015/wordml/symex" mc:Ignorable="w14 w15 w16se w16cid w16 w16cex w16sdtdh w16du">
   <w:docDefaults>
     <w:rPrDefault>
       <w:rPr>
@@ -4022,18 +4723,566 @@
       </w:pPr>
     </w:pPrDefault>
   </w:docDefaults>
-  <w:latentStyles w:count="276" w:defLockedState="0" w:defQFormat="0" w:defSemiHidden="0" w:defUIPriority="0" w:defUnhideWhenUsed="0"/>
+  <w:latentStyles w:count="376" w:defLockedState="0" w:defQFormat="0" w:defSemiHidden="0" w:defUIPriority="0" w:defUnhideWhenUsed="0">
+    <w:lsdException w:name="heading 5" w:semiHidden="1" w:unhideWhenUsed="1"/>
+    <w:lsdException w:name="index 2" w:semiHidden="1" w:unhideWhenUsed="1"/>
+    <w:lsdException w:name="index 3" w:semiHidden="1" w:unhideWhenUsed="1"/>
+    <w:lsdException w:name="index 4" w:semiHidden="1" w:unhideWhenUsed="1"/>
+    <w:lsdException w:name="index 5" w:semiHidden="1" w:unhideWhenUsed="1"/>
+    <w:lsdException w:name="index 6" w:semiHidden="1" w:unhideWhenUsed="1"/>
+    <w:lsdException w:name="index 7" w:semiHidden="1" w:unhideWhenUsed="1"/>
+    <w:lsdException w:name="index 8" w:semiHidden="1" w:unhideWhenUsed="1"/>
+    <w:lsdException w:name="index 9" w:semiHidden="1" w:unhideWhenUsed="1"/>
+    <w:lsdException w:name="toc 1" w:semiHidden="1" w:unhideWhenUsed="1"/>
+    <w:lsdException w:name="toc 2" w:semiHidden="1" w:unhideWhenUsed="1"/>
+    <w:lsdException w:name="toc 3" w:semiHidden="1" w:unhideWhenUsed="1"/>
+    <w:lsdException w:name="toc 4" w:semiHidden="1" w:unhideWhenUsed="1"/>
+    <w:lsdException w:name="toc 5" w:semiHidden="1" w:unhideWhenUsed="1"/>
+    <w:lsdException w:name="toc 6" w:semiHidden="1" w:unhideWhenUsed="1"/>
+    <w:lsdException w:name="toc 7" w:semiHidden="1" w:unhideWhenUsed="1"/>
+    <w:lsdException w:name="toc 8" w:semiHidden="1" w:unhideWhenUsed="1"/>
+    <w:lsdException w:name="toc 9" w:semiHidden="1" w:unhideWhenUsed="1"/>
+    <w:lsdException w:name="Normal Indent" w:semiHidden="1" w:unhideWhenUsed="1"/>
+    <w:lsdException w:name="footnote text" w:semiHidden="1" w:unhideWhenUsed="1"/>
+    <w:lsdException w:name="annotation text" w:semiHidden="1" w:unhideWhenUsed="1"/>
+    <w:lsdException w:name="header" w:semiHidden="1" w:unhideWhenUsed="1"/>
+    <w:lsdException w:name="footer" w:semiHidden="1" w:unhideWhenUsed="1"/>
+    <w:lsdException w:name="index heading" w:semiHidden="1" w:unhideWhenUsed="1"/>
+    <w:lsdException w:name="caption" w:semiHidden="1" w:unhideWhenUsed="1"/>
+    <w:lsdException w:name="table of figures" w:semiHidden="1" w:unhideWhenUsed="1"/>
+    <w:lsdException w:name="envelope address" w:semiHidden="1" w:unhideWhenUsed="1"/>
+    <w:lsdException w:name="envelope return" w:semiHidden="1" w:unhideWhenUsed="1"/>
+    <w:lsdException w:name="footnote reference" w:semiHidden="1" w:unhideWhenUsed="1"/>
+    <w:lsdException w:name="annotation reference" w:semiHidden="1" w:unhideWhenUsed="1"/>
+    <w:lsdException w:name="line number" w:semiHidden="1" w:unhideWhenUsed="1"/>
+    <w:lsdException w:name="page number" w:semiHidden="1" w:unhideWhenUsed="1"/>
+    <w:lsdException w:name="endnote reference" w:semiHidden="1" w:unhideWhenUsed="1"/>
+    <w:lsdException w:name="endnote text" w:semiHidden="1" w:unhideWhenUsed="1"/>
+    <w:lsdException w:name="table of authorities" w:semiHidden="1" w:unhideWhenUsed="1"/>
+    <w:lsdException w:name="macro" w:semiHidden="1" w:unhideWhenUsed="1"/>
+    <w:lsdException w:name="toa heading" w:semiHidden="1" w:unhideWhenUsed="1"/>
+    <w:lsdException w:name="List" w:semiHidden="1" w:unhideWhenUsed="1"/>
+    <w:lsdException w:name="List Bullet" w:semiHidden="1" w:unhideWhenUsed="1"/>
+    <w:lsdException w:name="List Number" w:semiHidden="1" w:unhideWhenUsed="1"/>
+    <w:lsdException w:name="List 2" w:semiHidden="1" w:unhideWhenUsed="1"/>
+    <w:lsdException w:name="List 3" w:semiHidden="1" w:unhideWhenUsed="1"/>
+    <w:lsdException w:name="List 4" w:semiHidden="1" w:unhideWhenUsed="1"/>
+    <w:lsdException w:name="List Bullet 2" w:semiHidden="1" w:unhideWhenUsed="1"/>
+    <w:lsdException w:name="List Bullet 3" w:semiHidden="1" w:unhideWhenUsed="1"/>
+    <w:lsdException w:name="List Number 2" w:semiHidden="1" w:unhideWhenUsed="1"/>
+    <w:lsdException w:name="List Number 3" w:semiHidden="1" w:unhideWhenUsed="1"/>
+    <w:lsdException w:name="List Number 4" w:semiHidden="1" w:unhideWhenUsed="1"/>
+    <w:lsdException w:name="List Number 5" w:semiHidden="1" w:unhideWhenUsed="1"/>
+    <w:lsdException w:name="Closing" w:semiHidden="1" w:unhideWhenUsed="1"/>
+    <w:lsdException w:name="Signature" w:semiHidden="1" w:unhideWhenUsed="1"/>
+    <w:lsdException w:name="Default Paragraph Font" w:semiHidden="1" w:unhideWhenUsed="1"/>
+    <w:lsdException w:name="Body Text" w:semiHidden="1" w:unhideWhenUsed="1"/>
+    <w:lsdException w:name="Body Text Indent" w:semiHidden="1" w:unhideWhenUsed="1"/>
+    <w:lsdException w:name="List Continue" w:semiHidden="1" w:unhideWhenUsed="1"/>
+    <w:lsdException w:name="List Continue 2" w:semiHidden="1" w:unhideWhenUsed="1"/>
+    <w:lsdException w:name="List Continue 3" w:semiHidden="1" w:unhideWhenUsed="1"/>
+    <w:lsdException w:name="List Continue 4" w:semiHidden="1" w:unhideWhenUsed="1"/>
+    <w:lsdException w:name="List Continue 5" w:semiHidden="1" w:unhideWhenUsed="1"/>
+    <w:lsdException w:name="Message Header" w:semiHidden="1" w:unhideWhenUsed="1"/>
+    <w:lsdException w:name="Salutation" w:semiHidden="1" w:unhideWhenUsed="1"/>
+    <w:lsdException w:name="Date" w:semiHidden="1" w:unhideWhenUsed="1"/>
+    <w:lsdException w:name="Body Text First Indent" w:semiHidden="1" w:unhideWhenUsed="1"/>
+    <w:lsdException w:name="Body Text Indent 2" w:semiHidden="1" w:unhideWhenUsed="1"/>
+    <w:lsdException w:name="Body Text Indent 3" w:semiHidden="1" w:unhideWhenUsed="1"/>
+    <w:lsdException w:name="Block Text" w:semiHidden="1" w:unhideWhenUsed="1"/>
+    <w:lsdException w:name="Hyperlink" w:semiHidden="1" w:unhideWhenUsed="1"/>
+    <w:lsdException w:name="FollowedHyperlink" w:semiHidden="1" w:unhideWhenUsed="1"/>
+    <w:lsdException w:name="Document Map" w:semiHidden="1" w:unhideWhenUsed="1"/>
+    <w:lsdException w:name="Plain Text" w:semiHidden="1" w:unhideWhenUsed="1"/>
+    <w:lsdException w:name="E-mail Signature" w:semiHidden="1" w:unhideWhenUsed="1"/>
+    <w:lsdException w:name="HTML Top of Form" w:semiHidden="1" w:unhideWhenUsed="1"/>
+    <w:lsdException w:name="HTML Bottom of Form" w:semiHidden="1" w:unhideWhenUsed="1"/>
+    <w:lsdException w:name="Normal (Web)" w:semiHidden="1" w:unhideWhenUsed="1"/>
+    <w:lsdException w:name="HTML Acronym" w:semiHidden="1" w:unhideWhenUsed="1"/>
+    <w:lsdException w:name="HTML Address" w:semiHidden="1" w:unhideWhenUsed="1"/>
+    <w:lsdException w:name="HTML Cite" w:semiHidden="1" w:unhideWhenUsed="1"/>
+    <w:lsdException w:name="HTML Code" w:semiHidden="1" w:unhideWhenUsed="1"/>
+    <w:lsdException w:name="HTML Definition" w:semiHidden="1" w:unhideWhenUsed="1"/>
+    <w:lsdException w:name="HTML Keyboard" w:semiHidden="1" w:unhideWhenUsed="1"/>
+    <w:lsdException w:name="HTML Preformatted" w:semiHidden="1" w:unhideWhenUsed="1"/>
+    <w:lsdException w:name="HTML Sample" w:semiHidden="1" w:unhideWhenUsed="1"/>
+    <w:lsdException w:name="HTML Typewriter" w:semiHidden="1" w:unhideWhenUsed="1"/>
+    <w:lsdException w:name="HTML Variable" w:semiHidden="1" w:unhideWhenUsed="1"/>
+    <w:lsdException w:name="Normal Table" w:semiHidden="1" w:unhideWhenUsed="1"/>
+    <w:lsdException w:name="annotation subject" w:semiHidden="1" w:unhideWhenUsed="1"/>
+    <w:lsdException w:name="No List" w:semiHidden="1" w:unhideWhenUsed="1"/>
+    <w:lsdException w:name="Outline List 1" w:semiHidden="1" w:unhideWhenUsed="1"/>
+    <w:lsdException w:name="Outline List 2" w:semiHidden="1" w:unhideWhenUsed="1"/>
+    <w:lsdException w:name="Outline List 3" w:semiHidden="1" w:unhideWhenUsed="1"/>
+    <w:lsdException w:name="Table Simple 1" w:semiHidden="1" w:unhideWhenUsed="1"/>
+    <w:lsdException w:name="Table Simple 2" w:semiHidden="1" w:unhideWhenUsed="1"/>
+    <w:lsdException w:name="Table Simple 3" w:semiHidden="1" w:unhideWhenUsed="1"/>
+    <w:lsdException w:name="Table Classic 1" w:semiHidden="1" w:unhideWhenUsed="1"/>
+    <w:lsdException w:name="Table Classic 2" w:semiHidden="1" w:unhideWhenUsed="1"/>
+    <w:lsdException w:name="Table Classic 3" w:semiHidden="1" w:unhideWhenUsed="1"/>
+    <w:lsdException w:name="Table Classic 4" w:semiHidden="1" w:unhideWhenUsed="1"/>
+    <w:lsdException w:name="Table Colorful 1" w:semiHidden="1" w:unhideWhenUsed="1"/>
+    <w:lsdException w:name="Table Colorful 2" w:semiHidden="1" w:unhideWhenUsed="1"/>
+    <w:lsdException w:name="Table Colorful 3" w:semiHidden="1" w:unhideWhenUsed="1"/>
+    <w:lsdException w:name="Table Columns 1" w:semiHidden="1" w:unhideWhenUsed="1"/>
+    <w:lsdException w:name="Table Columns 2" w:semiHidden="1" w:unhideWhenUsed="1"/>
+    <w:lsdException w:name="Table Columns 3" w:semiHidden="1" w:unhideWhenUsed="1"/>
+    <w:lsdException w:name="Table Columns 4" w:semiHidden="1" w:unhideWhenUsed="1"/>
+    <w:lsdException w:name="Table Columns 5" w:semiHidden="1" w:unhideWhenUsed="1"/>
+    <w:lsdException w:name="Table Grid 1" w:semiHidden="1" w:unhideWhenUsed="1"/>
+    <w:lsdException w:name="Table Grid 2" w:semiHidden="1" w:unhideWhenUsed="1"/>
+    <w:lsdException w:name="Table Grid 3" w:semiHidden="1" w:unhideWhenUsed="1"/>
+    <w:lsdException w:name="Table Grid 4" w:semiHidden="1" w:unhideWhenUsed="1"/>
+    <w:lsdException w:name="Table Grid 5" w:semiHidden="1" w:unhideWhenUsed="1"/>
+    <w:lsdException w:name="Table Grid 6" w:semiHidden="1" w:unhideWhenUsed="1"/>
+    <w:lsdException w:name="Table Grid 7" w:semiHidden="1" w:unhideWhenUsed="1"/>
+    <w:lsdException w:name="Table Grid 8" w:semiHidden="1" w:unhideWhenUsed="1"/>
+    <w:lsdException w:name="Table List 1" w:semiHidden="1" w:unhideWhenUsed="1"/>
+    <w:lsdException w:name="Table List 2" w:semiHidden="1" w:unhideWhenUsed="1"/>
+    <w:lsdException w:name="Table List 3" w:semiHidden="1" w:unhideWhenUsed="1"/>
+    <w:lsdException w:name="Table List 4" w:semiHidden="1" w:unhideWhenUsed="1"/>
+    <w:lsdException w:name="Table List 5" w:semiHidden="1" w:unhideWhenUsed="1"/>
+    <w:lsdException w:name="Table List 6" w:semiHidden="1" w:unhideWhenUsed="1"/>
+    <w:lsdException w:name="Table List 7" w:semiHidden="1" w:unhideWhenUsed="1"/>
+    <w:lsdException w:name="Table List 8" w:semiHidden="1" w:unhideWhenUsed="1"/>
+    <w:lsdException w:name="Table 3D effects 1" w:semiHidden="1" w:unhideWhenUsed="1"/>
+    <w:lsdException w:name="Table 3D effects 2" w:semiHidden="1" w:unhideWhenUsed="1"/>
+    <w:lsdException w:name="Table 3D effects 3" w:semiHidden="1" w:unhideWhenUsed="1"/>
+    <w:lsdException w:name="Table Contemporary" w:semiHidden="1" w:unhideWhenUsed="1"/>
+    <w:lsdException w:name="Table Elegant" w:semiHidden="1" w:unhideWhenUsed="1"/>
+    <w:lsdException w:name="Table Professional" w:semiHidden="1" w:unhideWhenUsed="1"/>
+    <w:lsdException w:name="Table Subtle 1" w:semiHidden="1" w:unhideWhenUsed="1"/>
+    <w:lsdException w:name="Table Subtle 2" w:semiHidden="1" w:unhideWhenUsed="1"/>
+    <w:lsdException w:name="Table Web 1" w:semiHidden="1" w:unhideWhenUsed="1"/>
+    <w:lsdException w:name="Table Web 2" w:semiHidden="1" w:unhideWhenUsed="1"/>
+    <w:lsdException w:name="Table Web 3" w:semiHidden="1" w:unhideWhenUsed="1"/>
+    <w:lsdException w:name="Balloon Text" w:semiHidden="1" w:unhideWhenUsed="1"/>
+    <w:lsdException w:name="Table Theme" w:semiHidden="1" w:unhideWhenUsed="1"/>
+    <w:lsdException w:name="Placeholder Text" w:semiHidden="1"/>
+    <w:lsdException w:name="Light Shading"/>
+    <w:lsdException w:name="Light List"/>
+    <w:lsdException w:name="Light Grid"/>
+    <w:lsdException w:name="Medium Shading 1"/>
+    <w:lsdException w:name="Medium Shading 2"/>
+    <w:lsdException w:name="Medium List 1"/>
+    <w:lsdException w:name="Medium List 2"/>
+    <w:lsdException w:name="Medium Grid 1"/>
+    <w:lsdException w:name="Medium Grid 2"/>
+    <w:lsdException w:name="Medium Grid 3"/>
+    <w:lsdException w:name="Dark List"/>
+    <w:lsdException w:name="Colorful Shading"/>
+    <w:lsdException w:name="Colorful List"/>
+    <w:lsdException w:name="Colorful Grid"/>
+    <w:lsdException w:name="Light Shading Accent 1"/>
+    <w:lsdException w:name="Light List Accent 1"/>
+    <w:lsdException w:name="Light Grid Accent 1"/>
+    <w:lsdException w:name="Medium Shading 1 Accent 1"/>
+    <w:lsdException w:name="Medium Shading 2 Accent 1"/>
+    <w:lsdException w:name="Medium List 1 Accent 1"/>
+    <w:lsdException w:name="Revision" w:semiHidden="1"/>
+    <w:lsdException w:name="Medium List 2 Accent 1"/>
+    <w:lsdException w:name="Medium Grid 1 Accent 1"/>
+    <w:lsdException w:name="Medium Grid 2 Accent 1"/>
+    <w:lsdException w:name="Medium Grid 3 Accent 1"/>
+    <w:lsdException w:name="Dark List Accent 1"/>
+    <w:lsdException w:name="Colorful Shading Accent 1"/>
+    <w:lsdException w:name="Colorful List Accent 1"/>
+    <w:lsdException w:name="Colorful Grid Accent 1"/>
+    <w:lsdException w:name="Light Shading Accent 2"/>
+    <w:lsdException w:name="Light List Accent 2"/>
+    <w:lsdException w:name="Light Grid Accent 2"/>
+    <w:lsdException w:name="Medium Shading 1 Accent 2"/>
+    <w:lsdException w:name="Medium Shading 2 Accent 2"/>
+    <w:lsdException w:name="Medium List 1 Accent 2"/>
+    <w:lsdException w:name="Medium List 2 Accent 2"/>
+    <w:lsdException w:name="Medium Grid 1 Accent 2"/>
+    <w:lsdException w:name="Medium Grid 2 Accent 2"/>
+    <w:lsdException w:name="Medium Grid 3 Accent 2"/>
+    <w:lsdException w:name="Dark List Accent 2"/>
+    <w:lsdException w:name="Colorful Shading Accent 2"/>
+    <w:lsdException w:name="Colorful List Accent 2"/>
+    <w:lsdException w:name="Colorful Grid Accent 2"/>
+    <w:lsdException w:name="Light Shading Accent 3"/>
+    <w:lsdException w:name="Light List Accent 3"/>
+    <w:lsdException w:name="Light Grid Accent 3"/>
+    <w:lsdException w:name="Medium Shading 1 Accent 3"/>
+    <w:lsdException w:name="Medium Shading 2 Accent 3"/>
+    <w:lsdException w:name="Medium List 1 Accent 3"/>
+    <w:lsdException w:name="Medium List 2 Accent 3"/>
+    <w:lsdException w:name="Medium Grid 1 Accent 3"/>
+    <w:lsdException w:name="Medium Grid 2 Accent 3"/>
+    <w:lsdException w:name="Medium Grid 3 Accent 3"/>
+    <w:lsdException w:name="Dark List Accent 3"/>
+    <w:lsdException w:name="Colorful Shading Accent 3"/>
+    <w:lsdException w:name="Colorful List Accent 3"/>
+    <w:lsdException w:name="Colorful Grid Accent 3"/>
+    <w:lsdException w:name="Light Shading Accent 4"/>
+    <w:lsdException w:name="Light List Accent 4"/>
+    <w:lsdException w:name="Light Grid Accent 4"/>
+    <w:lsdException w:name="Medium Shading 1 Accent 4"/>
+    <w:lsdException w:name="Medium Shading 2 Accent 4"/>
+    <w:lsdException w:name="Medium List 1 Accent 4"/>
+    <w:lsdException w:name="Medium List 2 Accent 4"/>
+    <w:lsdException w:name="Medium Grid 1 Accent 4"/>
+    <w:lsdException w:name="Medium Grid 2 Accent 4"/>
+    <w:lsdException w:name="Medium Grid 3 Accent 4"/>
+    <w:lsdException w:name="Dark List Accent 4"/>
+    <w:lsdException w:name="Colorful Shading Accent 4"/>
+    <w:lsdException w:name="Colorful List Accent 4"/>
+    <w:lsdException w:name="Colorful Grid Accent 4"/>
+    <w:lsdException w:name="Light Shading Accent 5"/>
+    <w:lsdException w:name="Light List Accent 5"/>
+    <w:lsdException w:name="Light Grid Accent 5"/>
+    <w:lsdException w:name="Medium Shading 1 Accent 5"/>
+    <w:lsdException w:name="Medium Shading 2 Accent 5"/>
+    <w:lsdException w:name="Medium List 1 Accent 5"/>
+    <w:lsdException w:name="Medium List 2 Accent 5"/>
+    <w:lsdException w:name="Medium Grid 1 Accent 5"/>
+    <w:lsdException w:name="Medium Grid 2 Accent 5"/>
+    <w:lsdException w:name="Medium Grid 3 Accent 5"/>
+    <w:lsdException w:name="Dark List Accent 5"/>
+    <w:lsdException w:name="Colorful Shading Accent 5"/>
+    <w:lsdException w:name="Colorful List Accent 5"/>
+    <w:lsdException w:name="Colorful Grid Accent 5"/>
+    <w:lsdException w:name="Light Shading Accent 6"/>
+    <w:lsdException w:name="Light List Accent 6"/>
+    <w:lsdException w:name="Light Grid Accent 6"/>
+    <w:lsdException w:name="Medium Shading 1 Accent 6"/>
+    <w:lsdException w:name="Medium Shading 2 Accent 6"/>
+    <w:lsdException w:name="Medium List 1 Accent 6"/>
+    <w:lsdException w:name="Medium List 2 Accent 6"/>
+    <w:lsdException w:name="Medium Grid 1 Accent 6"/>
+    <w:lsdException w:name="Medium Grid 2 Accent 6"/>
+    <w:lsdException w:name="Medium Grid 3 Accent 6"/>
+    <w:lsdException w:name="Dark List Accent 6"/>
+    <w:lsdException w:name="Colorful Shading Accent 6"/>
+    <w:lsdException w:name="Colorful List Accent 6"/>
+    <w:lsdException w:name="Colorful Grid Accent 6"/>
+    <w:lsdException w:name="Bibliography" w:semiHidden="1" w:unhideWhenUsed="1"/>
+    <w:lsdException w:name="TOC Heading" w:semiHidden="1" w:unhideWhenUsed="1"/>
+    <w:lsdException w:name="Grid Table 4" w:uiPriority="49"/>
+    <w:lsdException w:name="Grid Table 5 Dark" w:uiPriority="50"/>
+    <w:lsdException w:name="Grid Table 6 Colorful" w:uiPriority="51"/>
+    <w:lsdException w:name="Grid Table 7 Colorful" w:uiPriority="52"/>
+    <w:lsdException w:name="Grid Table 1 Light Accent 1" w:uiPriority="46"/>
+    <w:lsdException w:name="Grid Table 2 Accent 1" w:uiPriority="47"/>
+    <w:lsdException w:name="Grid Table 3 Accent 1" w:uiPriority="48"/>
+    <w:lsdException w:name="Grid Table 4 Accent 1" w:uiPriority="49"/>
+    <w:lsdException w:name="Grid Table 5 Dark Accent 1" w:uiPriority="50"/>
+    <w:lsdException w:name="Grid Table 6 Colorful Accent 1" w:uiPriority="51"/>
+    <w:lsdException w:name="Grid Table 7 Colorful Accent 1" w:uiPriority="52"/>
+    <w:lsdException w:name="Grid Table 1 Light Accent 2" w:uiPriority="46"/>
+    <w:lsdException w:name="Grid Table 2 Accent 2" w:uiPriority="47"/>
+    <w:lsdException w:name="Grid Table 3 Accent 2" w:uiPriority="48"/>
+    <w:lsdException w:name="Grid Table 4 Accent 2" w:uiPriority="49"/>
+    <w:lsdException w:name="Grid Table 5 Dark Accent 2" w:uiPriority="50"/>
+    <w:lsdException w:name="Grid Table 6 Colorful Accent 2" w:uiPriority="51"/>
+    <w:lsdException w:name="Grid Table 7 Colorful Accent 2" w:uiPriority="52"/>
+    <w:lsdException w:name="Grid Table 1 Light Accent 3" w:uiPriority="46"/>
+    <w:lsdException w:name="Grid Table 2 Accent 3" w:uiPriority="47"/>
+    <w:lsdException w:name="Grid Table 3 Accent 3" w:uiPriority="48"/>
+    <w:lsdException w:name="Grid Table 4 Accent 3" w:uiPriority="49"/>
+    <w:lsdException w:name="Grid Table 5 Dark Accent 3" w:uiPriority="50"/>
+    <w:lsdException w:name="Grid Table 6 Colorful Accent 3" w:uiPriority="51"/>
+    <w:lsdException w:name="Grid Table 7 Colorful Accent 3" w:uiPriority="52"/>
+    <w:lsdException w:name="Grid Table 1 Light Accent 4" w:uiPriority="46"/>
+    <w:lsdException w:name="Grid Table 2 Accent 4" w:uiPriority="47"/>
+    <w:lsdException w:name="Grid Table 3 Accent 4" w:uiPriority="48"/>
+    <w:lsdException w:name="Grid Table 4 Accent 4" w:uiPriority="49"/>
+    <w:lsdException w:name="Grid Table 5 Dark Accent 4" w:uiPriority="50"/>
+    <w:lsdException w:name="Grid Table 6 Colorful Accent 4" w:uiPriority="51"/>
+    <w:lsdException w:name="Grid Table 7 Colorful Accent 4" w:uiPriority="52"/>
+    <w:lsdException w:name="Grid Table 1 Light Accent 5" w:uiPriority="46"/>
+    <w:lsdException w:name="Grid Table 2 Accent 5" w:uiPriority="47"/>
+    <w:lsdException w:name="Grid Table 3 Accent 5" w:uiPriority="48"/>
+    <w:lsdException w:name="Grid Table 4 Accent 5" w:uiPriority="49"/>
+    <w:lsdException w:name="Grid Table 5 Dark Accent 5" w:uiPriority="50"/>
+    <w:lsdException w:name="Grid Table 6 Colorful Accent 5" w:uiPriority="51"/>
+    <w:lsdException w:name="Grid Table 7 Colorful Accent 5" w:uiPriority="52"/>
+    <w:lsdException w:name="Grid Table 1 Light Accent 6" w:uiPriority="46"/>
+    <w:lsdException w:name="Grid Table 2 Accent 6" w:uiPriority="47"/>
+    <w:lsdException w:name="Grid Table 3 Accent 6" w:uiPriority="48"/>
+    <w:lsdException w:name="Grid Table 4 Accent 6" w:uiPriority="49"/>
+    <w:lsdException w:name="Grid Table 5 Dark Accent 6" w:uiPriority="50"/>
+    <w:lsdException w:name="Grid Table 6 Colorful Accent 6" w:uiPriority="51"/>
+    <w:lsdException w:name="Grid Table 7 Colorful Accent 6" w:uiPriority="52"/>
+    <w:lsdException w:name="List Table 1 Light" w:uiPriority="46"/>
+    <w:lsdException w:name="List Table 2" w:uiPriority="47"/>
+    <w:lsdException w:name="List Table 3" w:uiPriority="48"/>
+    <w:lsdException w:name="List Table 4" w:uiPriority="49"/>
+    <w:lsdException w:name="List Table 5 Dark" w:uiPriority="50"/>
+    <w:lsdException w:name="List Table 6 Colorful" w:uiPriority="51"/>
+    <w:lsdException w:name="List Table 7 Colorful" w:uiPriority="52"/>
+    <w:lsdException w:name="List Table 1 Light Accent 1" w:uiPriority="46"/>
+    <w:lsdException w:name="List Table 2 Accent 1" w:uiPriority="47"/>
+    <w:lsdException w:name="List Table 3 Accent 1" w:uiPriority="48"/>
+    <w:lsdException w:name="List Table 4 Accent 1" w:uiPriority="49"/>
+    <w:lsdException w:name="List Table 5 Dark Accent 1" w:uiPriority="50"/>
+    <w:lsdException w:name="List Table 6 Colorful Accent 1" w:uiPriority="51"/>
+    <w:lsdException w:name="List Table 7 Colorful Accent 1" w:uiPriority="52"/>
+    <w:lsdException w:name="List Table 1 Light Accent 2" w:uiPriority="46"/>
+    <w:lsdException w:name="List Table 2 Accent 2" w:uiPriority="47"/>
+    <w:lsdException w:name="List Table 3 Accent 2" w:uiPriority="48"/>
+    <w:lsdException w:name="List Table 4 Accent 2" w:uiPriority="49"/>
+    <w:lsdException w:name="List Table 5 Dark Accent 2" w:uiPriority="50"/>
+    <w:lsdException w:name="List Table 6 Colorful Accent 2" w:uiPriority="51"/>
+    <w:lsdException w:name="List Table 7 Colorful Accent 2" w:uiPriority="52"/>
+    <w:lsdException w:name="List Table 1 Light Accent 3" w:uiPriority="46"/>
+    <w:lsdException w:name="List Table 2 Accent 3" w:uiPriority="47"/>
+    <w:lsdException w:name="List Table 3 Accent 3" w:uiPriority="48"/>
+    <w:lsdException w:name="List Table 4 Accent 3" w:uiPriority="49"/>
+    <w:lsdException w:name="List Table 5 Dark Accent 3" w:uiPriority="50"/>
+    <w:lsdException w:name="List Table 6 Colorful Accent 3" w:uiPriority="51"/>
+    <w:lsdException w:name="List Table 7 Colorful Accent 3" w:uiPriority="52"/>
+    <w:lsdException w:name="List Table 1 Light Accent 4" w:uiPriority="46"/>
+    <w:lsdException w:name="List Table 2 Accent 4" w:uiPriority="47"/>
+    <w:lsdException w:name="List Table 3 Accent 4" w:uiPriority="48"/>
+    <w:lsdException w:name="List Table 4 Accent 4" w:uiPriority="49"/>
+    <w:lsdException w:name="List Table 5 Dark Accent 4" w:uiPriority="50"/>
+    <w:lsdException w:name="List Table 6 Colorful Accent 4" w:uiPriority="51"/>
+    <w:lsdException w:name="List Table 7 Colorful Accent 4" w:uiPriority="52"/>
+    <w:lsdException w:name="List Table 1 Light Accent 5" w:uiPriority="46"/>
+    <w:lsdException w:name="List Table 2 Accent 5" w:uiPriority="47"/>
+    <w:lsdException w:name="List Table 3 Accent 5" w:uiPriority="48"/>
+    <w:lsdException w:name="List Table 4 Accent 5" w:uiPriority="49"/>
+    <w:lsdException w:name="List Table 5 Dark Accent 5" w:uiPriority="50"/>
+    <w:lsdException w:name="List Table 6 Colorful Accent 5" w:uiPriority="51"/>
+    <w:lsdException w:name="List Table 7 Colorful Accent 5" w:uiPriority="52"/>
+    <w:lsdException w:name="List Table 1 Light Accent 6" w:uiPriority="46"/>
+    <w:lsdException w:name="List Table 2 Accent 6" w:uiPriority="47"/>
+    <w:lsdException w:name="List Table 3 Accent 6" w:uiPriority="48"/>
+    <w:lsdException w:name="List Table 4 Accent 6" w:uiPriority="49"/>
+    <w:lsdException w:name="List Table 5 Dark Accent 6" w:uiPriority="50"/>
+    <w:lsdException w:name="List Table 6 Colorful Accent 6" w:uiPriority="51"/>
+    <w:lsdException w:name="List Table 7 Colorful Accent 6" w:uiPriority="52"/>
+    <w:lsdException w:name="Mention" w:semiHidden="1" w:uiPriority="99" w:unhideWhenUsed="1"/>
+    <w:lsdException w:name="Smart Hyperlink" w:semiHidden="1" w:uiPriority="99" w:unhideWhenUsed="1"/>
+    <w:lsdException w:name="Hashtag" w:semiHidden="1" w:uiPriority="99" w:unhideWhenUsed="1"/>
+    <w:lsdException w:name="Unresolved Mention" w:semiHidden="1" w:uiPriority="99" w:unhideWhenUsed="1"/>
+    <w:lsdException w:name="Smart Link" w:semiHidden="1" w:uiPriority="99" w:unhideWhenUsed="1"/>
+  </w:latentStyles>
   <w:style w:default="1" w:styleId="Normal" w:type="paragraph">
     <w:name w:val="Normal"/>
     <w:qFormat/>
+    <w:rsid w:val="00CA66A9"/>
+    <w:pPr>
+      <w:spacing w:after="0" w:line="432" w:lineRule="auto"/>
+    </w:pPr>
+    <w:rPr>
+      <w:rFonts w:ascii="Times New Roman" w:hAnsi="Times New Roman"/>
+    </w:rPr>
+  </w:style>
+  <w:style w:styleId="Heading1" w:type="paragraph">
+    <w:name w:val="heading 1"/>
+    <w:basedOn w:val="Normal"/>
+    <w:next w:val="BodyText"/>
+    <w:uiPriority w:val="9"/>
+    <w:qFormat/>
+    <w:rsid w:val="00CA66A9"/>
+    <w:pPr>
+      <w:keepNext/>
+      <w:keepLines/>
+      <w:spacing w:before="480"/>
+      <w:jc w:val="center"/>
+      <w:outlineLvl w:val="0"/>
+    </w:pPr>
+    <w:rPr>
+      <w:rFonts w:cstheme="majorBidi" w:eastAsiaTheme="majorEastAsia"/>
+      <w:b/>
+      <w:bCs/>
+      <w:color w:themeColor="text1" w:val="000000"/>
+      <w:szCs w:val="32"/>
+    </w:rPr>
+  </w:style>
+  <w:style w:styleId="Heading2" w:type="paragraph">
+    <w:name w:val="heading 2"/>
+    <w:basedOn w:val="Normal"/>
+    <w:next w:val="BodyText"/>
+    <w:uiPriority w:val="9"/>
+    <w:unhideWhenUsed/>
+    <w:qFormat/>
+    <w:rsid w:val="004B30E0"/>
+    <w:pPr>
+      <w:keepNext/>
+      <w:keepLines/>
+      <w:spacing w:before="240"/>
+      <w:outlineLvl w:val="1"/>
+    </w:pPr>
+    <w:rPr>
+      <w:rFonts w:cstheme="majorBidi" w:eastAsiaTheme="majorEastAsia"/>
+      <w:b/>
+      <w:bCs/>
+      <w:szCs w:val="28"/>
+    </w:rPr>
+  </w:style>
+  <w:style w:styleId="Heading3" w:type="paragraph">
+    <w:name w:val="heading 3"/>
+    <w:basedOn w:val="Normal"/>
+    <w:next w:val="BodyText"/>
+    <w:uiPriority w:val="9"/>
+    <w:unhideWhenUsed/>
+    <w:qFormat/>
+    <w:rsid w:val="004B30E0"/>
+    <w:pPr>
+      <w:keepNext/>
+      <w:keepLines/>
+      <w:outlineLvl w:val="2"/>
+    </w:pPr>
+    <w:rPr>
+      <w:rFonts w:cstheme="majorBidi" w:eastAsiaTheme="majorEastAsia"/>
+      <w:b/>
+      <w:bCs/>
+      <w:i/>
+    </w:rPr>
+  </w:style>
+  <w:style w:styleId="Heading4" w:type="paragraph">
+    <w:name w:val="heading 4"/>
+    <w:basedOn w:val="Normal"/>
+    <w:next w:val="BodyText"/>
+    <w:uiPriority w:val="9"/>
+    <w:unhideWhenUsed/>
+    <w:qFormat/>
+    <w:rsid w:val="004B30E0"/>
+    <w:pPr>
+      <w:keepNext/>
+      <w:keepLines/>
+      <w:ind w:left="720"/>
+      <w:outlineLvl w:val="3"/>
+    </w:pPr>
+    <w:rPr>
+      <w:rFonts w:cstheme="majorBidi" w:eastAsiaTheme="majorEastAsia"/>
+      <w:b/>
+      <w:bCs/>
+    </w:rPr>
+  </w:style>
+  <w:style w:styleId="Heading5" w:type="paragraph">
+    <w:name w:val="heading 5"/>
+    <w:basedOn w:val="Normal"/>
+    <w:next w:val="BodyText"/>
+    <w:uiPriority w:val="9"/>
+    <w:unhideWhenUsed/>
+    <w:qFormat/>
+    <w:rsid w:val="004B30E0"/>
+    <w:pPr>
+      <w:keepNext/>
+      <w:keepLines/>
+      <w:ind w:left="720"/>
+      <w:outlineLvl w:val="4"/>
+    </w:pPr>
+    <w:rPr>
+      <w:rFonts w:cstheme="majorBidi" w:eastAsiaTheme="majorEastAsia"/>
+      <w:b/>
+      <w:i/>
+      <w:iCs/>
+    </w:rPr>
+  </w:style>
+  <w:style w:styleId="Heading6" w:type="paragraph">
+    <w:name w:val="heading 6"/>
+    <w:basedOn w:val="Normal"/>
+    <w:next w:val="BodyText"/>
+    <w:uiPriority w:val="9"/>
+    <w:unhideWhenUsed/>
+    <w:qFormat/>
+    <w:pPr>
+      <w:keepNext/>
+      <w:keepLines/>
+      <w:spacing w:before="200"/>
+      <w:outlineLvl w:val="5"/>
+    </w:pPr>
+    <w:rPr>
+      <w:rFonts w:asciiTheme="majorHAnsi" w:cstheme="majorBidi" w:eastAsiaTheme="majorEastAsia" w:hAnsiTheme="majorHAnsi"/>
+      <w:color w:themeColor="accent1" w:val="4F81BD"/>
+    </w:rPr>
+  </w:style>
+  <w:style w:styleId="Heading7" w:type="paragraph">
+    <w:name w:val="heading 7"/>
+    <w:basedOn w:val="Normal"/>
+    <w:next w:val="BodyText"/>
+    <w:uiPriority w:val="9"/>
+    <w:unhideWhenUsed/>
+    <w:qFormat/>
+    <w:pPr>
+      <w:keepNext/>
+      <w:keepLines/>
+      <w:spacing w:before="200"/>
+      <w:outlineLvl w:val="6"/>
+    </w:pPr>
+    <w:rPr>
+      <w:rFonts w:asciiTheme="majorHAnsi" w:cstheme="majorBidi" w:eastAsiaTheme="majorEastAsia" w:hAnsiTheme="majorHAnsi"/>
+      <w:color w:themeColor="accent1" w:val="4F81BD"/>
+    </w:rPr>
+  </w:style>
+  <w:style w:styleId="Heading8" w:type="paragraph">
+    <w:name w:val="heading 8"/>
+    <w:basedOn w:val="Normal"/>
+    <w:next w:val="BodyText"/>
+    <w:uiPriority w:val="9"/>
+    <w:unhideWhenUsed/>
+    <w:qFormat/>
+    <w:pPr>
+      <w:keepNext/>
+      <w:keepLines/>
+      <w:spacing w:before="200"/>
+      <w:outlineLvl w:val="7"/>
+    </w:pPr>
+    <w:rPr>
+      <w:rFonts w:asciiTheme="majorHAnsi" w:cstheme="majorBidi" w:eastAsiaTheme="majorEastAsia" w:hAnsiTheme="majorHAnsi"/>
+      <w:color w:themeColor="accent1" w:val="4F81BD"/>
+    </w:rPr>
+  </w:style>
+  <w:style w:styleId="Heading9" w:type="paragraph">
+    <w:name w:val="heading 9"/>
+    <w:basedOn w:val="Normal"/>
+    <w:next w:val="BodyText"/>
+    <w:uiPriority w:val="9"/>
+    <w:unhideWhenUsed/>
+    <w:qFormat/>
+    <w:pPr>
+      <w:keepNext/>
+      <w:keepLines/>
+      <w:spacing w:before="200"/>
+      <w:outlineLvl w:val="8"/>
+    </w:pPr>
+    <w:rPr>
+      <w:rFonts w:asciiTheme="majorHAnsi" w:cstheme="majorBidi" w:eastAsiaTheme="majorEastAsia" w:hAnsiTheme="majorHAnsi"/>
+      <w:color w:themeColor="accent1" w:val="4F81BD"/>
+    </w:rPr>
+  </w:style>
+  <w:style w:default="1" w:styleId="DefaultParagraphFont" w:type="character">
+    <w:name w:val="Default Paragraph Font"/>
+    <w:uiPriority w:val="1"/>
+    <w:semiHidden/>
+    <w:unhideWhenUsed/>
+  </w:style>
+  <w:style w:default="1" w:styleId="TableNormal" w:type="table">
+    <w:name w:val="Normal Table"/>
+    <w:uiPriority w:val="99"/>
+    <w:semiHidden/>
+    <w:unhideWhenUsed/>
+    <w:tblPr>
+      <w:tblInd w:type="dxa" w:w="0"/>
+      <w:tblCellMar>
+        <w:top w:type="dxa" w:w="0"/>
+        <w:left w:type="dxa" w:w="108"/>
+        <w:bottom w:type="dxa" w:w="0"/>
+        <w:right w:type="dxa" w:w="108"/>
+      </w:tblCellMar>
+    </w:tblPr>
+  </w:style>
+  <w:style w:default="1" w:styleId="NoList" w:type="numbering">
+    <w:name w:val="No List"/>
+    <w:uiPriority w:val="99"/>
+    <w:semiHidden/>
+    <w:unhideWhenUsed/>
   </w:style>
   <w:style w:styleId="BodyText" w:type="paragraph">
     <w:name w:val="Body Text"/>
     <w:basedOn w:val="Normal"/>
     <w:link w:val="BodyTextChar"/>
     <w:qFormat/>
+    <w:rsid w:val="00F1135C"/>
     <w:pPr>
-      <w:spacing w:after="180" w:before="180"/>
+      <w:ind w:firstLine="720"/>
     </w:pPr>
   </w:style>
   <w:style w:customStyle="1" w:styleId="FirstParagraph" w:type="paragraph">
@@ -4041,6 +5290,10 @@
     <w:basedOn w:val="BodyText"/>
     <w:next w:val="BodyText"/>
     <w:qFormat/>
+    <w:rsid w:val="00F1135C"/>
+    <w:pPr>
+      <w:ind w:firstLine="0"/>
+    </w:pPr>
   </w:style>
   <w:style w:customStyle="1" w:styleId="Compact" w:type="paragraph">
     <w:name w:val="Compact"/>
@@ -4054,110 +5307,59 @@
     <w:name w:val="Title"/>
     <w:basedOn w:val="Normal"/>
     <w:next w:val="BodyText"/>
-    <w:link w:val="TitleChar"/>
-    <w:uiPriority w:val="10"/>
     <w:qFormat/>
-    <w:rsid w:val="00A10FD9"/>
+    <w:rsid w:val="00CA66A9"/>
     <w:pPr>
-      <w:spacing w:after="80" w:line="240" w:lineRule="auto"/>
-      <w:contextualSpacing/>
+      <w:keepNext/>
+      <w:keepLines/>
       <w:jc w:val="center"/>
     </w:pPr>
     <w:rPr>
-      <w:rFonts w:asciiTheme="majorHAnsi" w:cstheme="majorBidi" w:eastAsiaTheme="majorEastAsia" w:hAnsiTheme="majorHAnsi"/>
-      <w:sz w:val="56"/>
-      <w:szCs w:val="56"/>
-    </w:rPr>
-  </w:style>
-  <w:style w:customStyle="1" w:styleId="TitleChar" w:type="character">
-    <w:name w:val="Title Char"/>
-    <w:basedOn w:val="DefaultParagraphFont"/>
-    <w:link w:val="Title"/>
-    <w:uiPriority w:val="10"/>
-    <w:rsid w:val="00A10FD9"/>
-    <w:rPr>
-      <w:rFonts w:asciiTheme="majorHAnsi" w:cstheme="majorBidi" w:eastAsiaTheme="majorEastAsia" w:hAnsiTheme="majorHAnsi"/>
-      <w:sz w:val="56"/>
-      <w:szCs w:val="56"/>
+      <w:rFonts w:cstheme="majorBidi" w:eastAsiaTheme="majorEastAsia"/>
+      <w:b/>
+      <w:bCs/>
+      <w:color w:themeColor="text1" w:val="000000"/>
+      <w:szCs w:val="36"/>
     </w:rPr>
   </w:style>
   <w:style w:styleId="Subtitle" w:type="paragraph">
     <w:name w:val="Subtitle"/>
     <w:basedOn w:val="Title"/>
     <w:next w:val="BodyText"/>
-    <w:link w:val="SubtitleChar"/>
-    <w:uiPriority w:val="11"/>
     <w:qFormat/>
-    <w:rsid w:val="00A10FD9"/>
-    <w:pPr>
-      <w:numPr>
-        <w:ilvl w:val="1"/>
-      </w:numPr>
-    </w:pPr>
+    <w:rsid w:val="00CA66A9"/>
     <w:rPr>
-      <w:rFonts w:cstheme="majorBidi" w:eastAsiaTheme="majorEastAsia"/>
-      <w:spacing w:val="15"/>
-      <w:sz w:val="28"/>
-      <w:szCs w:val="28"/>
-    </w:rPr>
-  </w:style>
-  <w:style w:customStyle="1" w:styleId="SubtitleChar" w:type="character">
-    <w:name w:val="Subtitle Char"/>
-    <w:basedOn w:val="DefaultParagraphFont"/>
-    <w:link w:val="Subtitle"/>
-    <w:uiPriority w:val="11"/>
-    <w:rsid w:val="00A10FD9"/>
-    <w:rPr>
-      <w:rFonts w:cstheme="majorBidi" w:eastAsiaTheme="majorEastAsia"/>
-      <w:color w:themeColor="text1" w:themeTint="A6" w:val="595959"/>
-      <w:spacing w:val="15"/>
-      <w:sz w:val="28"/>
-      <w:szCs w:val="28"/>
+      <w:szCs w:val="30"/>
     </w:rPr>
   </w:style>
   <w:style w:customStyle="1" w:styleId="Author" w:type="paragraph">
     <w:name w:val="Author"/>
-    <w:basedOn w:val="Title"/>
     <w:next w:val="BodyText"/>
     <w:qFormat/>
+    <w:rsid w:val="00CA66A9"/>
     <w:pPr>
       <w:keepNext/>
       <w:keepLines/>
+      <w:spacing w:after="0" w:line="432" w:lineRule="auto"/>
+      <w:jc w:val="center"/>
     </w:pPr>
     <w:rPr>
-      <w:sz w:val="24"/>
-      <w:szCs w:val="24"/>
+      <w:rFonts w:ascii="Times New Roman" w:hAnsi="Times New Roman"/>
     </w:rPr>
   </w:style>
   <w:style w:styleId="Date" w:type="paragraph">
     <w:name w:val="Date"/>
-    <w:basedOn w:val="Title"/>
     <w:next w:val="BodyText"/>
     <w:qFormat/>
+    <w:rsid w:val="00CA66A9"/>
     <w:pPr>
       <w:keepNext/>
       <w:keepLines/>
-    </w:pPr>
-    <w:rPr>
-      <w:sz w:val="24"/>
-      <w:szCs w:val="24"/>
-    </w:rPr>
-  </w:style>
-  <w:style w:customStyle="1" w:styleId="AbstractTitle" w:type="paragraph">
-    <w:name w:val="Abstract Title"/>
-    <w:basedOn w:val="Normal"/>
-    <w:next w:val="Abstract"/>
-    <w:qFormat/>
-    <w:pPr>
-      <w:keepNext/>
-      <w:keepLines/>
-      <w:spacing w:after="0" w:before="300"/>
+      <w:spacing w:after="0" w:line="432" w:lineRule="auto"/>
       <w:jc w:val="center"/>
     </w:pPr>
     <w:rPr>
-      <w:b/>
-      <w:sz w:val="20"/>
-      <w:szCs w:val="20"/>
+      <w:rFonts w:ascii="Times New Roman" w:hAnsi="Times New Roman"/>
     </w:rPr>
   </w:style>
   <w:style w:customStyle="1" w:styleId="Abstract" w:type="paragraph">
@@ -4165,10 +5367,12 @@
     <w:basedOn w:val="Normal"/>
     <w:next w:val="BodyText"/>
     <w:qFormat/>
+    <w:rsid w:val="00CA66A9"/>
     <w:pPr>
       <w:keepNext/>
       <w:keepLines/>
-      <w:spacing w:after="300" w:before="100"/>
+      <w:spacing w:after="300" w:before="300"/>
+      <w:ind w:left="720" w:right="720"/>
     </w:pPr>
     <w:rPr>
       <w:sz w:val="20"/>
@@ -4178,328 +5382,11 @@
   <w:style w:styleId="Bibliography" w:type="paragraph">
     <w:name w:val="Bibliography"/>
     <w:basedOn w:val="Normal"/>
-    <w:next w:val="Bibliography"/>
     <w:qFormat/>
-    <w:pPr/>
-    <w:rPr/>
-  </w:style>
-  <w:style w:styleId="Heading1" w:type="paragraph">
-    <w:name w:val="heading 1"/>
-    <w:basedOn w:val="Normal"/>
-    <w:next w:val="BodyText"/>
-    <w:link w:val="Heading1Char"/>
-    <w:uiPriority w:val="9"/>
-    <w:qFormat/>
-    <w:rsid w:val="00A10FD9"/>
+    <w:rsid w:val="004B30E0"/>
     <w:pPr>
-      <w:keepNext/>
-      <w:keepLines/>
-      <w:spacing w:after="80" w:before="360"/>
-      <w:outlineLvl w:val="0"/>
+      <w:ind w:hanging="720" w:left="720"/>
     </w:pPr>
-    <w:rPr>
-      <w:rFonts w:asciiTheme="majorHAnsi" w:cstheme="majorBidi" w:eastAsiaTheme="majorEastAsia" w:hAnsiTheme="majorHAnsi"/>
-      <w:color w:themeColor="accent1" w:themeShade="BF" w:val="0F4761"/>
-      <w:sz w:val="40"/>
-      <w:szCs w:val="40"/>
-    </w:rPr>
-  </w:style>
-  <w:style w:styleId="Heading2" w:type="paragraph">
-    <w:name w:val="heading 2"/>
-    <w:basedOn w:val="Normal"/>
-    <w:next w:val="BodyText"/>
-    <w:link w:val="Heading2Char"/>
-    <w:uiPriority w:val="9"/>
-    <w:semiHidden/>
-    <w:unhideWhenUsed/>
-    <w:qFormat/>
-    <w:rsid w:val="00A10FD9"/>
-    <w:pPr>
-      <w:keepNext/>
-      <w:keepLines/>
-      <w:spacing w:after="80" w:before="160"/>
-      <w:outlineLvl w:val="1"/>
-    </w:pPr>
-    <w:rPr>
-      <w:rFonts w:asciiTheme="majorHAnsi" w:cstheme="majorBidi" w:eastAsiaTheme="majorEastAsia" w:hAnsiTheme="majorHAnsi"/>
-      <w:color w:themeColor="accent1" w:themeShade="BF" w:val="0F4761"/>
-      <w:sz w:val="32"/>
-      <w:szCs w:val="32"/>
-    </w:rPr>
-  </w:style>
-  <w:style w:styleId="Heading3" w:type="paragraph">
-    <w:name w:val="heading 3"/>
-    <w:basedOn w:val="Normal"/>
-    <w:next w:val="BodyText"/>
-    <w:link w:val="Heading3Char"/>
-    <w:uiPriority w:val="9"/>
-    <w:semiHidden/>
-    <w:unhideWhenUsed/>
-    <w:qFormat/>
-    <w:rsid w:val="00A10FD9"/>
-    <w:pPr>
-      <w:keepNext/>
-      <w:keepLines/>
-      <w:spacing w:after="80" w:before="160"/>
-      <w:outlineLvl w:val="2"/>
-    </w:pPr>
-    <w:rPr>
-      <w:rFonts w:cstheme="majorBidi" w:eastAsiaTheme="majorEastAsia"/>
-      <w:color w:themeColor="accent1" w:themeShade="BF" w:val="0F4761"/>
-      <w:sz w:val="28"/>
-      <w:szCs w:val="28"/>
-    </w:rPr>
-  </w:style>
-  <w:style w:styleId="Heading4" w:type="paragraph">
-    <w:name w:val="heading 4"/>
-    <w:basedOn w:val="Normal"/>
-    <w:next w:val="BodyText"/>
-    <w:link w:val="Heading4Char"/>
-    <w:uiPriority w:val="9"/>
-    <w:semiHidden/>
-    <w:unhideWhenUsed/>
-    <w:qFormat/>
-    <w:rsid w:val="00A10FD9"/>
-    <w:pPr>
-      <w:keepNext/>
-      <w:keepLines/>
-      <w:spacing w:after="40" w:before="80"/>
-      <w:outlineLvl w:val="3"/>
-    </w:pPr>
-    <w:rPr>
-      <w:rFonts w:cstheme="majorBidi" w:eastAsiaTheme="majorEastAsia"/>
-      <w:i/>
-      <w:iCs/>
-      <w:color w:themeColor="accent1" w:themeShade="BF" w:val="0F4761"/>
-    </w:rPr>
-  </w:style>
-  <w:style w:styleId="Heading5" w:type="paragraph">
-    <w:name w:val="heading 5"/>
-    <w:basedOn w:val="Normal"/>
-    <w:next w:val="BodyText"/>
-    <w:link w:val="Heading5Char"/>
-    <w:uiPriority w:val="9"/>
-    <w:semiHidden/>
-    <w:unhideWhenUsed/>
-    <w:qFormat/>
-    <w:rsid w:val="00A10FD9"/>
-    <w:pPr>
-      <w:keepNext/>
-      <w:keepLines/>
-      <w:spacing w:after="40" w:before="80"/>
-      <w:outlineLvl w:val="4"/>
-    </w:pPr>
-    <w:rPr>
-      <w:rFonts w:cstheme="majorBidi" w:eastAsiaTheme="majorEastAsia"/>
-      <w:color w:themeColor="accent1" w:themeShade="BF" w:val="0F4761"/>
-    </w:rPr>
-  </w:style>
-  <w:style w:styleId="Heading6" w:type="paragraph">
-    <w:name w:val="heading 6"/>
-    <w:basedOn w:val="Normal"/>
-    <w:next w:val="BodyText"/>
-    <w:link w:val="Heading6Char"/>
-    <w:uiPriority w:val="9"/>
-    <w:semiHidden/>
-    <w:unhideWhenUsed/>
-    <w:qFormat/>
-    <w:rsid w:val="00A10FD9"/>
-    <w:pPr>
-      <w:keepNext/>
-      <w:keepLines/>
-      <w:spacing w:after="0" w:before="40"/>
-      <w:outlineLvl w:val="5"/>
-    </w:pPr>
-    <w:rPr>
-      <w:rFonts w:cstheme="majorBidi" w:eastAsiaTheme="majorEastAsia"/>
-      <w:i/>
-      <w:iCs/>
-      <w:color w:themeColor="text1" w:themeTint="A6" w:val="595959"/>
-    </w:rPr>
-  </w:style>
-  <w:style w:styleId="Heading7" w:type="paragraph">
-    <w:name w:val="heading 7"/>
-    <w:basedOn w:val="Normal"/>
-    <w:next w:val="BodyText"/>
-    <w:link w:val="Heading7Char"/>
-    <w:uiPriority w:val="9"/>
-    <w:semiHidden/>
-    <w:unhideWhenUsed/>
-    <w:qFormat/>
-    <w:rsid w:val="00A10FD9"/>
-    <w:pPr>
-      <w:keepNext/>
-      <w:keepLines/>
-      <w:spacing w:after="0" w:before="40"/>
-      <w:outlineLvl w:val="6"/>
-    </w:pPr>
-    <w:rPr>
-      <w:rFonts w:cstheme="majorBidi" w:eastAsiaTheme="majorEastAsia"/>
-      <w:color w:themeColor="text1" w:themeTint="A6" w:val="595959"/>
-    </w:rPr>
-  </w:style>
-  <w:style w:styleId="Heading8" w:type="paragraph">
-    <w:name w:val="heading 8"/>
-    <w:basedOn w:val="Normal"/>
-    <w:next w:val="BodyText"/>
-    <w:link w:val="Heading8Char"/>
-    <w:uiPriority w:val="9"/>
-    <w:semiHidden/>
-    <w:unhideWhenUsed/>
-    <w:qFormat/>
-    <w:rsid w:val="00A10FD9"/>
-    <w:pPr>
-      <w:keepNext/>
-      <w:keepLines/>
-      <w:spacing w:after="0"/>
-      <w:outlineLvl w:val="7"/>
-    </w:pPr>
-    <w:rPr>
-      <w:rFonts w:cstheme="majorBidi" w:eastAsiaTheme="majorEastAsia"/>
-      <w:i/>
-      <w:iCs/>
-      <w:color w:themeColor="text1" w:themeTint="D8" w:val="272727"/>
-    </w:rPr>
-  </w:style>
-  <w:style w:styleId="Heading9" w:type="paragraph">
-    <w:name w:val="heading 9"/>
-    <w:basedOn w:val="Normal"/>
-    <w:next w:val="BodyText"/>
-    <w:link w:val="Heading9Char"/>
-    <w:uiPriority w:val="9"/>
-    <w:semiHidden/>
-    <w:unhideWhenUsed/>
-    <w:qFormat/>
-    <w:rsid w:val="00A10FD9"/>
-    <w:pPr>
-      <w:keepNext/>
-      <w:keepLines/>
-      <w:spacing w:after="0"/>
-      <w:outlineLvl w:val="8"/>
-    </w:pPr>
-    <w:rPr>
-      <w:rFonts w:cstheme="majorBidi" w:eastAsiaTheme="majorEastAsia"/>
-      <w:color w:themeColor="text1" w:themeTint="D8" w:val="272727"/>
-    </w:rPr>
-  </w:style>
-  <w:style w:customStyle="1" w:styleId="Heading1Char" w:type="character">
-    <w:name w:val="Heading 1 Char"/>
-    <w:basedOn w:val="DefaultParagraphFont"/>
-    <w:link w:val="Heading1"/>
-    <w:uiPriority w:val="9"/>
-    <w:rsid w:val="00A10FD9"/>
-    <w:rPr>
-      <w:rFonts w:asciiTheme="majorHAnsi" w:cstheme="majorBidi" w:eastAsiaTheme="majorEastAsia" w:hAnsiTheme="majorHAnsi"/>
-      <w:color w:themeColor="accent1" w:themeShade="BF" w:val="0F4761"/>
-      <w:sz w:val="40"/>
-      <w:szCs w:val="40"/>
-    </w:rPr>
-  </w:style>
-  <w:style w:customStyle="1" w:styleId="Heading2Char" w:type="character">
-    <w:name w:val="Heading 2 Char"/>
-    <w:basedOn w:val="DefaultParagraphFont"/>
-    <w:link w:val="Heading2"/>
-    <w:uiPriority w:val="9"/>
-    <w:semiHidden/>
-    <w:rsid w:val="00A10FD9"/>
-    <w:rPr>
-      <w:rFonts w:asciiTheme="majorHAnsi" w:cstheme="majorBidi" w:eastAsiaTheme="majorEastAsia" w:hAnsiTheme="majorHAnsi"/>
-      <w:color w:themeColor="accent1" w:themeShade="BF" w:val="0F4761"/>
-      <w:sz w:val="32"/>
-      <w:szCs w:val="32"/>
-    </w:rPr>
-  </w:style>
-  <w:style w:customStyle="1" w:styleId="Heading3Char" w:type="character">
-    <w:name w:val="Heading 3 Char"/>
-    <w:basedOn w:val="DefaultParagraphFont"/>
-    <w:link w:val="Heading3"/>
-    <w:uiPriority w:val="9"/>
-    <w:semiHidden/>
-    <w:rsid w:val="00A10FD9"/>
-    <w:rPr>
-      <w:rFonts w:cstheme="majorBidi" w:eastAsiaTheme="majorEastAsia"/>
-      <w:color w:themeColor="accent1" w:themeShade="BF" w:val="0F4761"/>
-      <w:sz w:val="28"/>
-      <w:szCs w:val="28"/>
-    </w:rPr>
-  </w:style>
-  <w:style w:customStyle="1" w:styleId="Heading4Char" w:type="character">
-    <w:name w:val="Heading 4 Char"/>
-    <w:basedOn w:val="DefaultParagraphFont"/>
-    <w:link w:val="Heading4"/>
-    <w:uiPriority w:val="9"/>
-    <w:semiHidden/>
-    <w:rsid w:val="00A10FD9"/>
-    <w:rPr>
-      <w:rFonts w:cstheme="majorBidi" w:eastAsiaTheme="majorEastAsia"/>
-      <w:i/>
-      <w:iCs/>
-      <w:color w:themeColor="accent1" w:themeShade="BF" w:val="0F4761"/>
-    </w:rPr>
-  </w:style>
-  <w:style w:customStyle="1" w:styleId="Heading5Char" w:type="character">
-    <w:name w:val="Heading 5 Char"/>
-    <w:basedOn w:val="DefaultParagraphFont"/>
-    <w:link w:val="Heading5"/>
-    <w:uiPriority w:val="9"/>
-    <w:semiHidden/>
-    <w:rsid w:val="00A10FD9"/>
-    <w:rPr>
-      <w:rFonts w:cstheme="majorBidi" w:eastAsiaTheme="majorEastAsia"/>
-      <w:color w:themeColor="accent1" w:themeShade="BF" w:val="0F4761"/>
-    </w:rPr>
-  </w:style>
-  <w:style w:customStyle="1" w:styleId="Heading6Char" w:type="character">
-    <w:name w:val="Heading 6 Char"/>
-    <w:basedOn w:val="DefaultParagraphFont"/>
-    <w:link w:val="Heading6"/>
-    <w:uiPriority w:val="9"/>
-    <w:semiHidden/>
-    <w:rsid w:val="00A10FD9"/>
-    <w:rPr>
-      <w:rFonts w:cstheme="majorBidi" w:eastAsiaTheme="majorEastAsia"/>
-      <w:i/>
-      <w:iCs/>
-      <w:color w:themeColor="text1" w:themeTint="A6" w:val="595959"/>
-    </w:rPr>
-  </w:style>
-  <w:style w:customStyle="1" w:styleId="Heading7Char" w:type="character">
-    <w:name w:val="Heading 7 Char"/>
-    <w:basedOn w:val="DefaultParagraphFont"/>
-    <w:link w:val="Heading7"/>
-    <w:uiPriority w:val="9"/>
-    <w:semiHidden/>
-    <w:rsid w:val="00A10FD9"/>
-    <w:rPr>
-      <w:rFonts w:cstheme="majorBidi" w:eastAsiaTheme="majorEastAsia"/>
-      <w:color w:themeColor="text1" w:themeTint="A6" w:val="595959"/>
-    </w:rPr>
-  </w:style>
-  <w:style w:customStyle="1" w:styleId="Heading8Char" w:type="character">
-    <w:name w:val="Heading 8 Char"/>
-    <w:basedOn w:val="DefaultParagraphFont"/>
-    <w:link w:val="Heading8"/>
-    <w:uiPriority w:val="9"/>
-    <w:semiHidden/>
-    <w:rsid w:val="00A10FD9"/>
-    <w:rPr>
-      <w:rFonts w:cstheme="majorBidi" w:eastAsiaTheme="majorEastAsia"/>
-      <w:i/>
-      <w:iCs/>
-      <w:color w:themeColor="text1" w:themeTint="D8" w:val="272727"/>
-    </w:rPr>
-  </w:style>
-  <w:style w:customStyle="1" w:styleId="Heading9Char" w:type="character">
-    <w:name w:val="Heading 9 Char"/>
-    <w:basedOn w:val="DefaultParagraphFont"/>
-    <w:link w:val="Heading9"/>
-    <w:uiPriority w:val="9"/>
-    <w:semiHidden/>
-    <w:rsid w:val="00A10FD9"/>
-    <w:rPr>
-      <w:rFonts w:cstheme="majorBidi" w:eastAsiaTheme="majorEastAsia"/>
-      <w:color w:themeColor="text1" w:themeTint="D8" w:val="272727"/>
-    </w:rPr>
   </w:style>
   <w:style w:styleId="BlockText" w:type="paragraph">
     <w:name w:val="Block Text"/>
@@ -4510,37 +5397,18 @@
     <w:qFormat/>
     <w:pPr>
       <w:spacing w:after="100" w:before="100"/>
-      <w:ind w:firstLine="0" w:left="480" w:right="480"/>
+      <w:ind w:left="480" w:right="480"/>
     </w:pPr>
   </w:style>
   <w:style w:styleId="FootnoteText" w:type="paragraph">
-    <w:name w:val="Footnote Text"/>
+    <w:name w:val="footnote text"/>
     <w:basedOn w:val="Normal"/>
-    <w:next w:val="FootnoteText"/>
     <w:uiPriority w:val="9"/>
     <w:unhideWhenUsed/>
     <w:qFormat/>
   </w:style>
-  <w:style w:styleId="FootnoteBlockText" w:type="paragraph">
-    <w:name w:val="Footnote Block Text"/>
-    <w:basedOn w:val="FootnoteText"/>
-    <w:next w:val="FootnoteText"/>
-    <w:uiPriority w:val="9"/>
-    <w:unhideWhenUsed/>
-    <w:qFormat/>
-    <w:pPr>
-      <w:spacing w:after="100" w:before="100"/>
-      <w:ind w:firstLine="0" w:left="480" w:right="480"/>
-    </w:pPr>
-  </w:style>
-  <w:style w:default="1" w:styleId="DefaultParagraphFont" w:type="character">
-    <w:name w:val="Default Paragraph Font"/>
-    <w:semiHidden/>
-    <w:unhideWhenUsed/>
-  </w:style>
-  <w:style w:default="1" w:styleId="Table" w:type="table">
+  <w:style w:customStyle="1" w:styleId="Table" w:type="table">
     <w:name w:val="Table"/>
-    <w:basedOn w:val="TableNormal"/>
     <w:semiHidden/>
     <w:unhideWhenUsed/>
     <w:qFormat/>
@@ -4556,14 +5424,13 @@
     <w:tblStylePr w:type="firstRow">
       <w:tblPr>
         <w:jc w:val="left"/>
-        <w:tblInd w:type="dxa" w:w="0"/>
       </w:tblPr>
       <w:trPr>
         <w:jc w:val="left"/>
       </w:trPr>
       <w:tcPr>
         <w:tcBorders>
-          <w:bottom w:val="single"/>
+          <w:bottom w:color="auto" w:space="0" w:sz="0" w:val="single"/>
         </w:tcBorders>
         <w:vAlign w:val="bottom"/>
       </w:tcPr>
@@ -4576,7 +5443,6 @@
     <w:pPr>
       <w:keepNext/>
       <w:keepLines/>
-      <w:spacing w:after="0"/>
     </w:pPr>
     <w:rPr>
       <w:b/>
@@ -4587,11 +5453,11 @@
     <w:basedOn w:val="Normal"/>
   </w:style>
   <w:style w:styleId="Caption" w:type="paragraph">
-    <w:name w:val="Caption"/>
+    <w:name w:val="caption"/>
     <w:basedOn w:val="Normal"/>
-    <w:link w:val="BodyTextChar"/>
+    <w:link w:val="CaptionChar"/>
     <w:pPr>
-      <w:spacing w:after="120" w:before="0"/>
+      <w:spacing w:after="120"/>
     </w:pPr>
     <w:rPr>
       <w:i/>
@@ -4619,14 +5485,15 @@
       <w:keepNext/>
     </w:pPr>
   </w:style>
-  <w:style w:customStyle="1" w:styleId="BodyTextChar" w:type="character">
-    <w:name w:val="Body Text Char"/>
+  <w:style w:customStyle="1" w:styleId="CaptionChar" w:type="character">
+    <w:name w:val="Caption Char"/>
     <w:basedOn w:val="DefaultParagraphFont"/>
-    <w:link w:val="BodyText"/>
+    <w:link w:val="Caption"/>
   </w:style>
   <w:style w:customStyle="1" w:styleId="VerbatimChar" w:type="character">
     <w:name w:val="Verbatim Char"/>
-    <w:basedOn w:val="BodyTextChar"/>
+    <w:basedOn w:val="CaptionChar"/>
+    <w:link w:val="SourceCode"/>
     <w:rPr>
       <w:rFonts w:ascii="Consolas" w:hAnsi="Consolas"/>
       <w:sz w:val="22"/>
@@ -4634,20 +5501,21 @@
   </w:style>
   <w:style w:customStyle="1" w:styleId="SectionNumber" w:type="character">
     <w:name w:val="Section Number"/>
-    <w:basedOn w:val="BodyTextChar"/>
+    <w:basedOn w:val="CaptionChar"/>
   </w:style>
   <w:style w:styleId="FootnoteReference" w:type="character">
-    <w:name w:val="Footnote Reference"/>
-    <w:basedOn w:val="BodyTextChar"/>
+    <w:name w:val="footnote reference"/>
+    <w:basedOn w:val="CaptionChar"/>
     <w:rPr>
       <w:vertAlign w:val="superscript"/>
     </w:rPr>
   </w:style>
   <w:style w:styleId="Hyperlink" w:type="character">
     <w:name w:val="Hyperlink"/>
-    <w:basedOn w:val="BodyTextChar"/>
+    <w:basedOn w:val="CaptionChar"/>
+    <w:rsid w:val="004B30E0"/>
     <w:rPr>
-      <w:color w:themeColor="accent1" w:val="4F81BD"/>
+      <w:color w:val="auto"/>
     </w:rPr>
   </w:style>
   <w:style w:styleId="TOCHeading" w:type="paragraph">
@@ -4662,20 +5530,60 @@
       <w:outlineLvl w:val="9"/>
     </w:pPr>
     <w:rPr>
-      <w:rFonts w:asciiTheme="majorHAnsi" w:cstheme="majorBidi" w:eastAsiaTheme="majorEastAsia" w:hAnsiTheme="majorHAnsi"/>
+      <w:rFonts w:asciiTheme="majorHAnsi" w:hAnsiTheme="majorHAnsi"/>
       <w:b w:val="0"/>
       <w:bCs w:val="0"/>
       <w:color w:themeColor="accent1" w:themeShade="BF" w:val="365F91"/>
     </w:rPr>
   </w:style>
-  <w:style w:type="paragraph" w:customStyle="1" w:styleId="SourceCode">
+  <w:style w:customStyle="1" w:styleId="BodyTextChar" w:type="character">
+    <w:name w:val="Body Text Char"/>
+    <w:basedOn w:val="DefaultParagraphFont"/>
+    <w:link w:val="BodyText"/>
+    <w:rsid w:val="00F1135C"/>
+    <w:rPr>
+      <w:rFonts w:ascii="Times New Roman" w:hAnsi="Times New Roman"/>
+    </w:rPr>
+  </w:style>
+  <w:style w:customStyle="1" w:styleId="SourceCode" w:type="paragraph">
     <w:name w:val="Source Code"/>
     <w:basedOn w:val="Normal"/>
     <w:link w:val="VerbatimChar"/>
+    <w:rsid w:val="00122113"/>
     <w:pPr>
-      <w:wordWrap w:val="off"/>
-      <w:shd w:val="clear" w:fill="f1f3f5"/>
+      <w:widowControl w:val="0"/>
+      <w:shd w:color="auto" w:fill="F8F8F8" w:val="clear"/>
+      <w:wordWrap w:val="0"/>
+      <w:spacing w:after="480" w:before="240" w:line="240" w:lineRule="auto"/>
+      <w:contextualSpacing/>
     </w:pPr>
+    <w:rPr>
+      <w:rFonts w:ascii="Consolas" w:hAnsi="Consolas"/>
+      <w:sz w:val="22"/>
+    </w:rPr>
+  </w:style>
+  <w:style w:customStyle="1" w:styleId="FunctionTok" w:type="character">
+    <w:name w:val="FunctionTok"/>
+    <w:basedOn w:val="VerbatimChar"/>
+    <w:rsid w:val="00122113"/>
+    <w:rPr>
+      <w:rFonts w:ascii="Consolas" w:hAnsi="Consolas"/>
+      <w:i/>
+      <w:color w:val="000000"/>
+      <w:sz w:val="22"/>
+      <w:shd w:color="auto" w:fill="F8F8F8" w:val="clear"/>
+    </w:rPr>
+  </w:style>
+  <w:style w:customStyle="1" w:styleId="NormalTok" w:type="character">
+    <w:name w:val="NormalTok"/>
+    <w:basedOn w:val="VerbatimChar"/>
+    <w:rsid w:val="00122113"/>
+    <w:rPr>
+      <w:rFonts w:ascii="Consolas" w:hAnsi="Consolas"/>
+      <w:i/>
+      <w:sz w:val="22"/>
+      <w:shd w:color="auto" w:fill="F8F8F8" w:val="clear"/>
+    </w:rPr>
   </w:style>
   <w:style w:type="character" w:customStyle="1" w:styleId="KeywordTok">
     <w:name w:val="KeywordTok"/>
@@ -4816,14 +5724,6 @@
       <w:shd w:val="clear" w:fill="f1f3f5"/>
     </w:rPr>
   </w:style>
-  <w:style w:type="character" w:customStyle="1" w:styleId="FunctionTok">
-    <w:name w:val="FunctionTok"/>
-    <w:basedOn w:val="VerbatimChar"/>
-    <w:rPr>
-      <w:color w:val="4758ab"/>
-      <w:shd w:val="clear" w:fill="f1f3f5"/>
-    </w:rPr>
-  </w:style>
   <w:style w:type="character" w:customStyle="1" w:styleId="VariableTok">
     <w:name w:val="VariableTok"/>
     <w:basedOn w:val="VerbatimChar"/>
@@ -4919,14 +5819,6 @@
     <w:basedOn w:val="VerbatimChar"/>
     <w:rPr>
       <w:color w:val="ad0000"/>
-      <w:shd w:val="clear" w:fill="f1f3f5"/>
-    </w:rPr>
-  </w:style>
-  <w:style w:type="character" w:customStyle="1" w:styleId="NormalTok">
-    <w:name w:val="NormalTok"/>
-    <w:basedOn w:val="VerbatimChar"/>
-    <w:rPr>
-      <w:color w:val="003b4f"/>
       <w:shd w:val="clear" w:fill="f1f3f5"/>
     </w:rPr>
   </w:style>
@@ -4944,44 +5836,44 @@
         <a:sysClr val="window" lastClr="FFFFFF"/>
       </a:lt1>
       <a:dk2>
-        <a:srgbClr val="0E2841"/>
+        <a:srgbClr val="1F497D"/>
       </a:dk2>
       <a:lt2>
-        <a:srgbClr val="E8E8E8"/>
+        <a:srgbClr val="EEECE1"/>
       </a:lt2>
       <a:accent1>
-        <a:srgbClr val="156082"/>
+        <a:srgbClr val="4F81BD"/>
       </a:accent1>
       <a:accent2>
-        <a:srgbClr val="E97132"/>
+        <a:srgbClr val="C0504D"/>
       </a:accent2>
       <a:accent3>
-        <a:srgbClr val="196B24"/>
+        <a:srgbClr val="9BBB59"/>
       </a:accent3>
       <a:accent4>
-        <a:srgbClr val="0F9ED5"/>
+        <a:srgbClr val="8064A2"/>
       </a:accent4>
       <a:accent5>
-        <a:srgbClr val="A02B93"/>
+        <a:srgbClr val="4BACC6"/>
       </a:accent5>
       <a:accent6>
-        <a:srgbClr val="4EA72E"/>
+        <a:srgbClr val="F79646"/>
       </a:accent6>
       <a:hlink>
-        <a:srgbClr val="467886"/>
+        <a:srgbClr val="0000FF"/>
       </a:hlink>
       <a:folHlink>
-        <a:srgbClr val="96607D"/>
+        <a:srgbClr val="800080"/>
       </a:folHlink>
     </a:clrScheme>
     <a:fontScheme name="Office">
       <a:majorFont>
-        <a:latin typeface="Aptos Display" panose="02110004020202020204"/>
+        <a:latin typeface="Calibri"/>
         <a:ea typeface=""/>
         <a:cs typeface=""/>
-        <a:font script="Jpan" typeface="游ゴシック Light"/>
+        <a:font script="Jpan" typeface="ＭＳ ゴシック"/>
         <a:font script="Hang" typeface="맑은 고딕"/>
-        <a:font script="Hans" typeface="等线 Light"/>
+        <a:font script="Hans" typeface="宋体"/>
         <a:font script="Hant" typeface="新細明體"/>
         <a:font script="Arab" typeface="Times New Roman"/>
         <a:font script="Hebr" typeface="Times New Roman"/>
@@ -5008,32 +5900,14 @@
         <a:font script="Mong" typeface="Mongolian Baiti"/>
         <a:font script="Viet" typeface="Times New Roman"/>
         <a:font script="Uigh" typeface="Microsoft Uighur"/>
-        <a:font script="Geor" typeface="Sylfaen"/>
-        <a:font script="Armn" typeface="Arial"/>
-        <a:font script="Bugi" typeface="Leelawadee UI"/>
-        <a:font script="Bopo" typeface="Microsoft JhengHei"/>
-        <a:font script="Java" typeface="Javanese Text"/>
-        <a:font script="Lisu" typeface="Segoe UI"/>
-        <a:font script="Mymr" typeface="Myanmar Text"/>
-        <a:font script="Nkoo" typeface="Ebrima"/>
-        <a:font script="Olck" typeface="Nirmala UI"/>
-        <a:font script="Osma" typeface="Ebrima"/>
-        <a:font script="Phag" typeface="Phagspa"/>
-        <a:font script="Syrn" typeface="Estrangelo Edessa"/>
-        <a:font script="Syrj" typeface="Estrangelo Edessa"/>
-        <a:font script="Syre" typeface="Estrangelo Edessa"/>
-        <a:font script="Sora" typeface="Nirmala UI"/>
-        <a:font script="Tale" typeface="Microsoft Tai Le"/>
-        <a:font script="Talu" typeface="Microsoft New Tai Lue"/>
-        <a:font script="Tfng" typeface="Ebrima"/>
       </a:majorFont>
       <a:minorFont>
-        <a:latin typeface="Aptos" panose="02110004020202020204"/>
+        <a:latin typeface="Cambria"/>
         <a:ea typeface=""/>
         <a:cs typeface=""/>
-        <a:font script="Jpan" typeface="游明朝"/>
+        <a:font script="Jpan" typeface="ＭＳ 明朝"/>
         <a:font script="Hang" typeface="맑은 고딕"/>
-        <a:font script="Hans" typeface="等线"/>
+        <a:font script="Hans" typeface="宋体"/>
         <a:font script="Hant" typeface="新細明體"/>
         <a:font script="Arab" typeface="Arial"/>
         <a:font script="Hebr" typeface="Arial"/>
@@ -5060,24 +5934,6 @@
         <a:font script="Mong" typeface="Mongolian Baiti"/>
         <a:font script="Viet" typeface="Arial"/>
         <a:font script="Uigh" typeface="Microsoft Uighur"/>
-        <a:font script="Geor" typeface="Sylfaen"/>
-        <a:font script="Armn" typeface="Arial"/>
-        <a:font script="Bugi" typeface="Leelawadee UI"/>
-        <a:font script="Bopo" typeface="Microsoft JhengHei"/>
-        <a:font script="Java" typeface="Javanese Text"/>
-        <a:font script="Lisu" typeface="Segoe UI"/>
-        <a:font script="Mymr" typeface="Myanmar Text"/>
-        <a:font script="Nkoo" typeface="Ebrima"/>
-        <a:font script="Olck" typeface="Nirmala UI"/>
-        <a:font script="Osma" typeface="Ebrima"/>
-        <a:font script="Phag" typeface="Phagspa"/>
-        <a:font script="Syrn" typeface="Estrangelo Edessa"/>
-        <a:font script="Syrj" typeface="Estrangelo Edessa"/>
-        <a:font script="Syre" typeface="Estrangelo Edessa"/>
-        <a:font script="Sora" typeface="Nirmala UI"/>
-        <a:font script="Tale" typeface="Microsoft Tai Le"/>
-        <a:font script="Talu" typeface="Microsoft New Tai Lue"/>
-        <a:font script="Tfng" typeface="Ebrima"/>
       </a:minorFont>
     </a:fontScheme>
     <a:fmtScheme name="Office">
@@ -5089,141 +5945,200 @@
           <a:gsLst>
             <a:gs pos="0">
               <a:schemeClr val="phClr">
-                <a:lumMod val="110000"/>
-                <a:satMod val="105000"/>
-                <a:tint val="67000"/>
+                <a:tint val="50000"/>
+                <a:satMod val="300000"/>
               </a:schemeClr>
             </a:gs>
-            <a:gs pos="50000">
+            <a:gs pos="35000">
               <a:schemeClr val="phClr">
-                <a:lumMod val="105000"/>
-                <a:satMod val="103000"/>
-                <a:tint val="73000"/>
+                <a:tint val="37000"/>
+                <a:satMod val="300000"/>
               </a:schemeClr>
             </a:gs>
             <a:gs pos="100000">
               <a:schemeClr val="phClr">
-                <a:lumMod val="105000"/>
-                <a:satMod val="109000"/>
-                <a:tint val="81000"/>
+                <a:tint val="15000"/>
+                <a:satMod val="350000"/>
               </a:schemeClr>
             </a:gs>
           </a:gsLst>
-          <a:lin ang="5400000" scaled="0"/>
+          <a:lin ang="16200000" scaled="1"/>
         </a:gradFill>
         <a:gradFill rotWithShape="1">
           <a:gsLst>
             <a:gs pos="0">
               <a:schemeClr val="phClr">
-                <a:satMod val="103000"/>
-                <a:lumMod val="102000"/>
-                <a:tint val="94000"/>
-              </a:schemeClr>
-            </a:gs>
-            <a:gs pos="50000">
-              <a:schemeClr val="phClr">
-                <a:satMod val="110000"/>
-                <a:lumMod val="100000"/>
+                <a:tint val="100000"/>
                 <a:shade val="100000"/>
+                <a:satMod val="130000"/>
               </a:schemeClr>
             </a:gs>
             <a:gs pos="100000">
               <a:schemeClr val="phClr">
-                <a:lumMod val="99000"/>
-                <a:satMod val="120000"/>
-                <a:shade val="78000"/>
+                <a:tint val="50000"/>
+                <a:shade val="100000"/>
+                <a:satMod val="350000"/>
               </a:schemeClr>
             </a:gs>
           </a:gsLst>
-          <a:lin ang="5400000" scaled="0"/>
+          <a:lin ang="16200000" scaled="0"/>
         </a:gradFill>
       </a:fillStyleLst>
       <a:lnStyleLst>
-        <a:ln w="6350" cap="flat" cmpd="sng" algn="ctr">
+        <a:ln w="9525" cap="flat" cmpd="sng" algn="ctr">
+          <a:solidFill>
+            <a:schemeClr val="phClr">
+              <a:shade val="95000"/>
+              <a:satMod val="105000"/>
+            </a:schemeClr>
+          </a:solidFill>
+          <a:prstDash val="solid"/>
+        </a:ln>
+        <a:ln w="25400" cap="flat" cmpd="sng" algn="ctr">
           <a:solidFill>
             <a:schemeClr val="phClr"/>
           </a:solidFill>
           <a:prstDash val="solid"/>
-          <a:miter lim="800000"/>
         </a:ln>
-        <a:ln w="12700" cap="flat" cmpd="sng" algn="ctr">
+        <a:ln w="38100" cap="flat" cmpd="sng" algn="ctr">
           <a:solidFill>
             <a:schemeClr val="phClr"/>
           </a:solidFill>
           <a:prstDash val="solid"/>
-          <a:miter lim="800000"/>
-        </a:ln>
-        <a:ln w="19050" cap="flat" cmpd="sng" algn="ctr">
-          <a:solidFill>
-            <a:schemeClr val="phClr"/>
-          </a:solidFill>
-          <a:prstDash val="solid"/>
-          <a:miter lim="800000"/>
         </a:ln>
       </a:lnStyleLst>
       <a:effectStyleLst>
         <a:effectStyle>
-          <a:effectLst/>
-        </a:effectStyle>
-        <a:effectStyle>
-          <a:effectLst/>
+          <a:effectLst>
+            <a:outerShdw blurRad="40000" dist="20000" dir="5400000" rotWithShape="0">
+              <a:srgbClr val="000000">
+                <a:alpha val="38000"/>
+              </a:srgbClr>
+            </a:outerShdw>
+          </a:effectLst>
         </a:effectStyle>
         <a:effectStyle>
           <a:effectLst>
-            <a:outerShdw blurRad="57150" dist="19050" dir="5400000" algn="ctr" rotWithShape="0">
+            <a:outerShdw blurRad="40000" dist="23000" dir="5400000" rotWithShape="0">
               <a:srgbClr val="000000">
-                <a:alpha val="63000"/>
+                <a:alpha val="35000"/>
               </a:srgbClr>
             </a:outerShdw>
           </a:effectLst>
+        </a:effectStyle>
+        <a:effectStyle>
+          <a:effectLst>
+            <a:outerShdw blurRad="40000" dist="23000" dir="5400000" rotWithShape="0">
+              <a:srgbClr val="000000">
+                <a:alpha val="35000"/>
+              </a:srgbClr>
+            </a:outerShdw>
+          </a:effectLst>
+          <a:scene3d>
+            <a:camera prst="orthographicFront">
+              <a:rot lat="0" lon="0" rev="0"/>
+            </a:camera>
+            <a:lightRig rig="threePt" dir="t">
+              <a:rot lat="0" lon="0" rev="1200000"/>
+            </a:lightRig>
+          </a:scene3d>
+          <a:sp3d>
+            <a:bevelT w="63500" h="25400"/>
+          </a:sp3d>
         </a:effectStyle>
       </a:effectStyleLst>
       <a:bgFillStyleLst>
         <a:solidFill>
           <a:schemeClr val="phClr"/>
         </a:solidFill>
-        <a:solidFill>
-          <a:schemeClr val="phClr">
-            <a:tint val="95000"/>
-            <a:satMod val="170000"/>
-          </a:schemeClr>
-        </a:solidFill>
         <a:gradFill rotWithShape="1">
           <a:gsLst>
             <a:gs pos="0">
               <a:schemeClr val="phClr">
-                <a:tint val="93000"/>
-                <a:satMod val="150000"/>
-                <a:shade val="98000"/>
-                <a:lumMod val="102000"/>
+                <a:tint val="40000"/>
+                <a:satMod val="350000"/>
               </a:schemeClr>
             </a:gs>
-            <a:gs pos="50000">
+            <a:gs pos="40000">
               <a:schemeClr val="phClr">
-                <a:tint val="98000"/>
-                <a:satMod val="130000"/>
-                <a:shade val="90000"/>
-                <a:lumMod val="103000"/>
+                <a:tint val="45000"/>
+                <a:shade val="99000"/>
+                <a:satMod val="350000"/>
               </a:schemeClr>
             </a:gs>
             <a:gs pos="100000">
               <a:schemeClr val="phClr">
-                <a:shade val="63000"/>
-                <a:satMod val="120000"/>
+                <a:shade val="20000"/>
+                <a:satMod val="255000"/>
               </a:schemeClr>
             </a:gs>
           </a:gsLst>
-          <a:lin ang="5400000" scaled="0"/>
+          <a:path path="circle">
+            <a:fillToRect l="50000" t="-80000" r="50000" b="180000"/>
+          </a:path>
+        </a:gradFill>
+        <a:gradFill rotWithShape="1">
+          <a:gsLst>
+            <a:gs pos="0">
+              <a:schemeClr val="phClr">
+                <a:tint val="80000"/>
+                <a:satMod val="300000"/>
+              </a:schemeClr>
+            </a:gs>
+            <a:gs pos="100000">
+              <a:schemeClr val="phClr">
+                <a:shade val="30000"/>
+                <a:satMod val="200000"/>
+              </a:schemeClr>
+            </a:gs>
+          </a:gsLst>
+          <a:path path="circle">
+            <a:fillToRect l="50000" t="50000" r="50000" b="50000"/>
+          </a:path>
         </a:gradFill>
       </a:bgFillStyleLst>
     </a:fmtScheme>
   </a:themeElements>
-  <a:objectDefaults/>
+  <a:objectDefaults>
+    <a:spDef>
+      <a:spPr/>
+      <a:bodyPr/>
+      <a:lstStyle/>
+      <a:style>
+        <a:lnRef idx="1">
+          <a:schemeClr val="accent1"/>
+        </a:lnRef>
+        <a:fillRef idx="3">
+          <a:schemeClr val="accent1"/>
+        </a:fillRef>
+        <a:effectRef idx="2">
+          <a:schemeClr val="accent1"/>
+        </a:effectRef>
+        <a:fontRef idx="minor">
+          <a:schemeClr val="lt1"/>
+        </a:fontRef>
+      </a:style>
+    </a:spDef>
+    <a:lnDef>
+      <a:spPr/>
+      <a:bodyPr/>
+      <a:lstStyle/>
+      <a:style>
+        <a:lnRef idx="2">
+          <a:schemeClr val="accent1"/>
+        </a:lnRef>
+        <a:fillRef idx="0">
+          <a:schemeClr val="accent1"/>
+        </a:fillRef>
+        <a:effectRef idx="1">
+          <a:schemeClr val="accent1"/>
+        </a:effectRef>
+        <a:fontRef idx="minor">
+          <a:schemeClr val="tx1"/>
+        </a:fontRef>
+      </a:style>
+    </a:lnDef>
+  </a:objectDefaults>
   <a:extraClrSchemeLst/>
-  <a:extLst>
-    <a:ext uri="{05A4C25C-085E-4340-85A3-A5531E510DB2}">
-      <thm15:themeFamily xmlns:thm15="http://schemas.microsoft.com/office/thememl/2012/main" name="Office Theme" id="{2E142A2C-CD16-42D6-873A-C26D2A0506FA}" vid="{1BDDFF52-6CD6-40A5-AB3C-68EB2F1E4D0A}"/>
-    </a:ext>
-  </a:extLst>
 </a:theme>
 </file>
</xml_diff>